<commit_message>
M1-01 M1-02 M1-03 M1-09 M1-10: add citations and references
</commit_message>
<xml_diff>
--- a/docs/PED/Phase-B.docx
+++ b/docs/PED/Phase-B.docx
@@ -4,8 +4,7 @@
   <w:body>
     <w:p>
       <w:pPr>
-        <w:keepNext/>
-        <w:spacing w:after="240" w:line="259" w:lineRule="auto"/>
+        <w:pStyle w:val="Heading1"/>
         <w:jc w:val="center"/>
         <w:rPr>
           <w:lang w:val="en-ZA"/>
@@ -13,9 +12,6 @@
       </w:pPr>
       <w:r>
         <w:rPr>
-          <w:b/>
-          <w:color w:val="000000"/>
-          <w:sz w:val="32"/>
           <w:lang w:val="en-ZA"/>
         </w:rPr>
         <w:t>Phase B</w:t>
@@ -23,17 +19,13 @@
     </w:p>
     <w:p>
       <w:pPr>
-        <w:keepNext/>
-        <w:spacing w:after="120" w:line="259" w:lineRule="auto"/>
+        <w:pStyle w:val="Heading2"/>
         <w:rPr>
           <w:lang w:val="en-ZA"/>
         </w:rPr>
       </w:pPr>
       <w:r>
         <w:rPr>
-          <w:b/>
-          <w:color w:val="000000"/>
-          <w:sz w:val="26"/>
           <w:lang w:val="en-ZA"/>
         </w:rPr>
         <w:t>M1-01: Problem and Business Need</w:t>
@@ -57,6 +49,73 @@
         </w:rPr>
         <w:t>CivicConnect addresses the problems caused by managing community service requests through disconnected channels such as email, telephone calls, WhatsApp, spreadsheets and paper records. This fragmented process can result in requests being duplicated, overlooked, incorrectly assigned or lost. Requesters have limited visibility of their requests, staff struggle to prioritise and coordinate work, and management lacks reliable information for monitoring service performance and accountability</w:t>
       </w:r>
+      <w:r>
+        <w:rPr>
+          <w:rFonts w:cs="Arial"/>
+          <w:color w:val="000000"/>
+          <w:sz w:val="22"/>
+          <w:lang w:val="en-ZA"/>
+        </w:rPr>
+        <w:t xml:space="preserve"> </w:t>
+      </w:r>
+      <w:sdt>
+        <w:sdtPr>
+          <w:rPr>
+            <w:rFonts w:cs="Arial"/>
+            <w:color w:val="000000"/>
+            <w:sz w:val="22"/>
+            <w:lang w:val="en-ZA"/>
+          </w:rPr>
+          <w:id w:val="-32734396"/>
+          <w:citation/>
+        </w:sdtPr>
+        <w:sdtContent>
+          <w:r>
+            <w:rPr>
+              <w:rFonts w:cs="Arial"/>
+              <w:color w:val="000000"/>
+              <w:sz w:val="22"/>
+              <w:lang w:val="en-ZA"/>
+            </w:rPr>
+            <w:fldChar w:fldCharType="begin"/>
+          </w:r>
+          <w:r>
+            <w:rPr>
+              <w:rFonts w:cs="Arial"/>
+              <w:color w:val="000000"/>
+              <w:sz w:val="22"/>
+            </w:rPr>
+            <w:instrText xml:space="preserve"> CITATION Bel6a \l 1033 </w:instrText>
+          </w:r>
+          <w:r>
+            <w:rPr>
+              <w:rFonts w:cs="Arial"/>
+              <w:color w:val="000000"/>
+              <w:sz w:val="22"/>
+              <w:lang w:val="en-ZA"/>
+            </w:rPr>
+            <w:fldChar w:fldCharType="separate"/>
+          </w:r>
+          <w:r>
+            <w:rPr>
+              <w:rFonts w:cs="Arial"/>
+              <w:noProof/>
+              <w:color w:val="000000"/>
+              <w:sz w:val="22"/>
+            </w:rPr>
+            <w:t>(Belgium Campus ITversity, 2026 a)</w:t>
+          </w:r>
+          <w:r>
+            <w:rPr>
+              <w:rFonts w:cs="Arial"/>
+              <w:color w:val="000000"/>
+              <w:sz w:val="22"/>
+              <w:lang w:val="en-ZA"/>
+            </w:rPr>
+            <w:fldChar w:fldCharType="end"/>
+          </w:r>
+        </w:sdtContent>
+      </w:sdt>
       <w:r>
         <w:rPr>
           <w:rFonts w:cs="Arial"/>
@@ -563,18 +622,13 @@
     </w:p>
     <w:p>
       <w:pPr>
-        <w:keepNext/>
-        <w:pageBreakBefore/>
-        <w:spacing w:after="120" w:line="259" w:lineRule="auto"/>
+        <w:pStyle w:val="Heading2"/>
         <w:rPr>
           <w:lang w:val="en-ZA"/>
         </w:rPr>
       </w:pPr>
       <w:r>
         <w:rPr>
-          <w:b/>
-          <w:color w:val="000000"/>
-          <w:sz w:val="26"/>
           <w:lang w:val="en-ZA"/>
         </w:rPr>
         <w:lastRenderedPageBreak/>
@@ -595,7 +649,75 @@
           <w:sz w:val="22"/>
           <w:lang w:val="en-ZA"/>
         </w:rPr>
-        <w:t>The stakeholder analysis identifies the people and groups who use, manage, support or are affected by CivicConnect. Their needs and expectations provide the basis for defining the project scope and requirements. The main stakeholder groups were identified from the project scenario and minimum business capabilities in the Master Project Brief.</w:t>
+        <w:t>The stakeholder analysis identifies the people and groups who use, manage, support or are affected by CivicConnect. Their needs and expectations provide the basis for defining the project scope and requirements. The main stakeholder groups were identified from the project scenario and minimum business capabilities in the Master Project Brief</w:t>
+      </w:r>
+      <w:r>
+        <w:rPr>
+          <w:color w:val="000000"/>
+          <w:sz w:val="22"/>
+          <w:lang w:val="en-ZA"/>
+        </w:rPr>
+        <w:t xml:space="preserve"> </w:t>
+      </w:r>
+      <w:sdt>
+        <w:sdtPr>
+          <w:rPr>
+            <w:color w:val="000000"/>
+            <w:sz w:val="22"/>
+            <w:lang w:val="en-ZA"/>
+          </w:rPr>
+          <w:id w:val="532923673"/>
+          <w:citation/>
+        </w:sdtPr>
+        <w:sdtContent>
+          <w:r>
+            <w:rPr>
+              <w:color w:val="000000"/>
+              <w:sz w:val="22"/>
+              <w:lang w:val="en-ZA"/>
+            </w:rPr>
+            <w:fldChar w:fldCharType="begin"/>
+          </w:r>
+          <w:r>
+            <w:rPr>
+              <w:color w:val="000000"/>
+              <w:sz w:val="22"/>
+            </w:rPr>
+            <w:instrText xml:space="preserve"> CITATION Bel6a \l 1033 </w:instrText>
+          </w:r>
+          <w:r>
+            <w:rPr>
+              <w:color w:val="000000"/>
+              <w:sz w:val="22"/>
+              <w:lang w:val="en-ZA"/>
+            </w:rPr>
+            <w:fldChar w:fldCharType="separate"/>
+          </w:r>
+          <w:r>
+            <w:rPr>
+              <w:noProof/>
+              <w:color w:val="000000"/>
+              <w:sz w:val="22"/>
+            </w:rPr>
+            <w:t>(Belgium Campus ITversity, 2026 a)</w:t>
+          </w:r>
+          <w:r>
+            <w:rPr>
+              <w:color w:val="000000"/>
+              <w:sz w:val="22"/>
+              <w:lang w:val="en-ZA"/>
+            </w:rPr>
+            <w:fldChar w:fldCharType="end"/>
+          </w:r>
+        </w:sdtContent>
+      </w:sdt>
+      <w:r>
+        <w:rPr>
+          <w:color w:val="000000"/>
+          <w:sz w:val="22"/>
+          <w:lang w:val="en-ZA"/>
+        </w:rPr>
+        <w:t>.</w:t>
       </w:r>
     </w:p>
     <w:p>
@@ -1637,15 +1759,7 @@
           <w:lang w:val="en-ZA"/>
         </w:rPr>
         <w:lastRenderedPageBreak/>
-        <w:t>Requesters have high interest because they are directly affected by the submission and tracking process, but they have less authority over organisational decisions. Service staff and management have both high influence and high interest because they use the platform to manage requests and influence how the service process operates. The organisation has high influence because it owns the platform and is responsible for its cost and operation. System administrators have high technical influence, although they</w:t>
-      </w:r>
-      <w:r>
-        <w:rPr>
-          <w:color w:val="000000"/>
-          <w:sz w:val="22"/>
-          <w:lang w:val="en-ZA"/>
-        </w:rPr>
-        <w:t xml:space="preserve"> may have less interest in the daily service-request process.</w:t>
+        <w:t>Requesters have high interest because they are directly affected by the submission and tracking process, but they have less authority over organisational decisions. Service staff and management have both high influence and high interest because they use the platform to manage requests and influence how the service process operates. The organisation has high influence because it owns the platform and is responsible for its cost and operation. System administrators have high technical influence, although they may have less interest in the daily service-request process.</w:t>
       </w:r>
     </w:p>
     <w:p>
@@ -2876,18 +2990,13 @@
     </w:p>
     <w:p>
       <w:pPr>
-        <w:keepNext/>
-        <w:pageBreakBefore/>
-        <w:spacing w:after="120" w:line="259" w:lineRule="auto"/>
+        <w:pStyle w:val="Heading2"/>
         <w:rPr>
           <w:lang w:val="en-ZA"/>
         </w:rPr>
       </w:pPr>
       <w:r>
         <w:rPr>
-          <w:b/>
-          <w:color w:val="000000"/>
-          <w:sz w:val="26"/>
           <w:lang w:val="en-ZA"/>
         </w:rPr>
         <w:lastRenderedPageBreak/>
@@ -2924,7 +3033,75 @@
           <w:sz w:val="22"/>
           <w:lang w:val="en-ZA"/>
         </w:rPr>
-        <w:t>Any change to the approved scope must be assessed, recorded and approved through the project’s change-control process.</w:t>
+        <w:t>Any change to the approved scope must be assessed, recorded and approved through the project’s change-control process</w:t>
+      </w:r>
+      <w:r>
+        <w:rPr>
+          <w:color w:val="000000"/>
+          <w:sz w:val="22"/>
+          <w:lang w:val="en-ZA"/>
+        </w:rPr>
+        <w:t xml:space="preserve"> </w:t>
+      </w:r>
+      <w:sdt>
+        <w:sdtPr>
+          <w:rPr>
+            <w:color w:val="000000"/>
+            <w:sz w:val="22"/>
+            <w:lang w:val="en-ZA"/>
+          </w:rPr>
+          <w:id w:val="-1186745632"/>
+          <w:citation/>
+        </w:sdtPr>
+        <w:sdtContent>
+          <w:r>
+            <w:rPr>
+              <w:color w:val="000000"/>
+              <w:sz w:val="22"/>
+              <w:lang w:val="en-ZA"/>
+            </w:rPr>
+            <w:fldChar w:fldCharType="begin"/>
+          </w:r>
+          <w:r>
+            <w:rPr>
+              <w:color w:val="000000"/>
+              <w:sz w:val="22"/>
+            </w:rPr>
+            <w:instrText xml:space="preserve"> CITATION Bel6a \l 1033 </w:instrText>
+          </w:r>
+          <w:r>
+            <w:rPr>
+              <w:color w:val="000000"/>
+              <w:sz w:val="22"/>
+              <w:lang w:val="en-ZA"/>
+            </w:rPr>
+            <w:fldChar w:fldCharType="separate"/>
+          </w:r>
+          <w:r>
+            <w:rPr>
+              <w:noProof/>
+              <w:color w:val="000000"/>
+              <w:sz w:val="22"/>
+            </w:rPr>
+            <w:t>(Belgium Campus ITversity, 2026 a)</w:t>
+          </w:r>
+          <w:r>
+            <w:rPr>
+              <w:color w:val="000000"/>
+              <w:sz w:val="22"/>
+              <w:lang w:val="en-ZA"/>
+            </w:rPr>
+            <w:fldChar w:fldCharType="end"/>
+          </w:r>
+        </w:sdtContent>
+      </w:sdt>
+      <w:r>
+        <w:rPr>
+          <w:color w:val="000000"/>
+          <w:sz w:val="22"/>
+          <w:lang w:val="en-ZA"/>
+        </w:rPr>
+        <w:t>.</w:t>
       </w:r>
     </w:p>
     <w:p>
@@ -5775,14 +5952,7 @@
           <w:sz w:val="22"/>
           <w:lang w:val="en-ZA"/>
         </w:rPr>
-        <w:t>The team has deliberately deferred a separate native mobile application from the current project scope. The Master Project Brief requires the core service-request capabilities but does not require a native mobile application. Building and testing separate mobile applications would increase the workload for a three-person team and could reduce the time available for completing and verifying the mandatory capabilities. The team will therefore prioritise a complete, controlled and testable core platform. A nat</w:t>
-      </w:r>
-      <w:r>
-        <w:rPr>
-          <w:sz w:val="22"/>
-          <w:lang w:val="en-ZA"/>
-        </w:rPr>
-        <w:t>ive mobile application may be reconsidered later if stakeholder evidence shows that it is necessary and the available schedule and resources can support it.</w:t>
+        <w:t>The team has deliberately deferred a separate native mobile application from the current project scope. The Master Project Brief requires the core service-request capabilities but does not require a native mobile application. Building and testing separate mobile applications would increase the workload for a three-person team and could reduce the time available for completing and verifying the mandatory capabilities. The team will therefore prioritise a complete, controlled and testable core platform. A native mobile application may be reconsidered later if stakeholder evidence shows that it is necessary and the available schedule and resources can support it.</w:t>
       </w:r>
     </w:p>
     <w:p>
@@ -5825,6 +5995,7 @@
       <w:pPr>
         <w:spacing w:after="120" w:line="259" w:lineRule="auto"/>
         <w:rPr>
+          <w:color w:val="000000"/>
           <w:sz w:val="22"/>
           <w:lang w:val="en-ZA"/>
         </w:rPr>
@@ -5835,23 +6006,103 @@
           <w:sz w:val="22"/>
           <w:lang w:val="en-ZA"/>
         </w:rPr>
-        <w:t>This scope statement forms the proposed M1 baseline. Once it has been reviewed and signed off by the team, items may not be added, removed or changed informally. Any proposed change must identify the affected requirements and consider its effect on schedule, cost, resources, quality, security, risk, testing and later project artefacts, as required by the Milestone 1 scope-control standard.</w:t>
+        <w:t>This scope statement forms the proposed M1 baseline. Once it has been reviewed and signed off by the team, items may not be added, removed or changed informally. Any proposed change must identify the affected requirements and consider its effect on schedule, cost, resources, quality, security, risk, testing and later project artefacts, as required by the Milestone 1 scope-control standard</w:t>
+      </w:r>
+      <w:r>
+        <w:rPr>
+          <w:color w:val="000000"/>
+          <w:sz w:val="22"/>
+          <w:lang w:val="en-ZA"/>
+        </w:rPr>
+        <w:t xml:space="preserve"> </w:t>
+      </w:r>
+      <w:sdt>
+        <w:sdtPr>
+          <w:rPr>
+            <w:color w:val="000000"/>
+            <w:sz w:val="22"/>
+            <w:lang w:val="en-ZA"/>
+          </w:rPr>
+          <w:id w:val="1642075150"/>
+          <w:citation/>
+        </w:sdtPr>
+        <w:sdtContent>
+          <w:r>
+            <w:rPr>
+              <w:color w:val="000000"/>
+              <w:sz w:val="22"/>
+              <w:lang w:val="en-ZA"/>
+            </w:rPr>
+            <w:fldChar w:fldCharType="begin"/>
+          </w:r>
+          <w:r>
+            <w:rPr>
+              <w:color w:val="000000"/>
+              <w:sz w:val="22"/>
+            </w:rPr>
+            <w:instrText xml:space="preserve"> CITATION Bel6b \l 1033 </w:instrText>
+          </w:r>
+          <w:r>
+            <w:rPr>
+              <w:color w:val="000000"/>
+              <w:sz w:val="22"/>
+              <w:lang w:val="en-ZA"/>
+            </w:rPr>
+            <w:fldChar w:fldCharType="separate"/>
+          </w:r>
+          <w:r>
+            <w:rPr>
+              <w:noProof/>
+              <w:color w:val="000000"/>
+              <w:sz w:val="22"/>
+            </w:rPr>
+            <w:t>(Belgium Campus ITversity, 2026 b)</w:t>
+          </w:r>
+          <w:r>
+            <w:rPr>
+              <w:color w:val="000000"/>
+              <w:sz w:val="22"/>
+              <w:lang w:val="en-ZA"/>
+            </w:rPr>
+            <w:fldChar w:fldCharType="end"/>
+          </w:r>
+        </w:sdtContent>
+      </w:sdt>
+      <w:r>
+        <w:rPr>
+          <w:color w:val="000000"/>
+          <w:sz w:val="22"/>
+          <w:lang w:val="en-ZA"/>
+        </w:rPr>
+        <w:t>.</w:t>
       </w:r>
     </w:p>
     <w:p>
       <w:pPr>
-        <w:keepNext/>
-        <w:pageBreakBefore/>
-        <w:spacing w:after="120" w:line="259" w:lineRule="auto"/>
+        <w:rPr>
+          <w:color w:val="000000"/>
+          <w:sz w:val="22"/>
+          <w:lang w:val="en-ZA"/>
+        </w:rPr>
+      </w:pPr>
+      <w:r>
+        <w:rPr>
+          <w:color w:val="000000"/>
+          <w:sz w:val="22"/>
+          <w:lang w:val="en-ZA"/>
+        </w:rPr>
+        <w:br w:type="page"/>
+      </w:r>
+    </w:p>
+    <w:p>
+      <w:pPr>
+        <w:pStyle w:val="Heading2"/>
         <w:rPr>
           <w:lang w:val="en-ZA"/>
         </w:rPr>
       </w:pPr>
       <w:r>
         <w:rPr>
-          <w:b/>
-          <w:color w:val="000000"/>
-          <w:sz w:val="26"/>
           <w:lang w:val="en-ZA"/>
         </w:rPr>
         <w:lastRenderedPageBreak/>
@@ -5874,6 +6125,126 @@
         </w:rPr>
         <w:t>Project constraints are conditions that limit or influence how CivicConnect can be planned, developed, tested and operated. These constraints must influence the project’s scope, requirements and later engineering decisions rather than only being listed. The following constraints are based on the Master Project Brief and the Milestone 1 objective</w:t>
       </w:r>
+      <w:r>
+        <w:rPr>
+          <w:color w:val="000000"/>
+          <w:sz w:val="22"/>
+          <w:lang w:val="en-ZA"/>
+        </w:rPr>
+        <w:t xml:space="preserve"> </w:t>
+      </w:r>
+      <w:sdt>
+        <w:sdtPr>
+          <w:rPr>
+            <w:color w:val="000000"/>
+            <w:sz w:val="22"/>
+            <w:lang w:val="en-ZA"/>
+          </w:rPr>
+          <w:id w:val="-1526701426"/>
+          <w:citation/>
+        </w:sdtPr>
+        <w:sdtContent>
+          <w:r>
+            <w:rPr>
+              <w:color w:val="000000"/>
+              <w:sz w:val="22"/>
+              <w:lang w:val="en-ZA"/>
+            </w:rPr>
+            <w:fldChar w:fldCharType="begin"/>
+          </w:r>
+          <w:r>
+            <w:rPr>
+              <w:color w:val="000000"/>
+              <w:sz w:val="22"/>
+            </w:rPr>
+            <w:instrText xml:space="preserve"> CITATION Bel6a \l 1033 </w:instrText>
+          </w:r>
+          <w:r>
+            <w:rPr>
+              <w:color w:val="000000"/>
+              <w:sz w:val="22"/>
+              <w:lang w:val="en-ZA"/>
+            </w:rPr>
+            <w:fldChar w:fldCharType="separate"/>
+          </w:r>
+          <w:r>
+            <w:rPr>
+              <w:noProof/>
+              <w:color w:val="000000"/>
+              <w:sz w:val="22"/>
+            </w:rPr>
+            <w:t>(Belgium Campus ITversity, 2026 a)</w:t>
+          </w:r>
+          <w:r>
+            <w:rPr>
+              <w:color w:val="000000"/>
+              <w:sz w:val="22"/>
+              <w:lang w:val="en-ZA"/>
+            </w:rPr>
+            <w:fldChar w:fldCharType="end"/>
+          </w:r>
+        </w:sdtContent>
+      </w:sdt>
+      <w:sdt>
+        <w:sdtPr>
+          <w:rPr>
+            <w:color w:val="000000"/>
+            <w:sz w:val="22"/>
+            <w:lang w:val="en-ZA"/>
+          </w:rPr>
+          <w:id w:val="-565801937"/>
+          <w:citation/>
+        </w:sdtPr>
+        <w:sdtContent>
+          <w:r>
+            <w:rPr>
+              <w:color w:val="000000"/>
+              <w:sz w:val="22"/>
+              <w:lang w:val="en-ZA"/>
+            </w:rPr>
+            <w:fldChar w:fldCharType="begin"/>
+          </w:r>
+          <w:r>
+            <w:rPr>
+              <w:color w:val="000000"/>
+              <w:sz w:val="22"/>
+            </w:rPr>
+            <w:instrText xml:space="preserve"> CITATION Bel6b \l 1033 </w:instrText>
+          </w:r>
+          <w:r>
+            <w:rPr>
+              <w:color w:val="000000"/>
+              <w:sz w:val="22"/>
+              <w:lang w:val="en-ZA"/>
+            </w:rPr>
+            <w:fldChar w:fldCharType="separate"/>
+          </w:r>
+          <w:r>
+            <w:rPr>
+              <w:noProof/>
+              <w:color w:val="000000"/>
+              <w:sz w:val="22"/>
+            </w:rPr>
+            <w:t xml:space="preserve"> </w:t>
+          </w:r>
+          <w:r>
+            <w:rPr>
+              <w:noProof/>
+              <w:color w:val="000000"/>
+              <w:sz w:val="22"/>
+            </w:rPr>
+            <w:t>(Belgium Campus ITversity, 2026 b)</w:t>
+          </w:r>
+          <w:r>
+            <w:rPr>
+              <w:color w:val="000000"/>
+              <w:sz w:val="22"/>
+              <w:lang w:val="en-ZA"/>
+            </w:rPr>
+            <w:fldChar w:fldCharType="end"/>
+          </w:r>
+        </w:sdtContent>
+      </w:sdt>
       <w:r>
         <w:rPr>
           <w:color w:val="000000"/>
@@ -7550,18 +7921,13 @@
     </w:p>
     <w:p>
       <w:pPr>
-        <w:keepNext/>
-        <w:pageBreakBefore/>
-        <w:spacing w:after="120" w:line="259" w:lineRule="auto"/>
+        <w:pStyle w:val="Heading2"/>
         <w:rPr>
           <w:lang w:val="en-ZA"/>
         </w:rPr>
       </w:pPr>
       <w:r>
         <w:rPr>
-          <w:b/>
-          <w:color w:val="000000"/>
-          <w:sz w:val="26"/>
           <w:lang w:val="en-ZA"/>
         </w:rPr>
         <w:lastRenderedPageBreak/>
@@ -7580,7 +7946,60 @@
           <w:sz w:val="22"/>
           <w:lang w:val="en-ZA"/>
         </w:rPr>
-        <w:t>Assumptions are conditions that the team currently believes to be true but has not yet fully confirmed. They differ from constraints because constraints are known limitations, while assumptions still require verification. If an important assumption is incorrect, it may affect the project’s scope, requirements, design, schedule, cost, quality or security. Material assumptions must therefore be monitored and considered in the Risk Register (SEN381 CivicConnect Master Project Brief, 2026).</w:t>
+        <w:t xml:space="preserve">Assumptions are conditions that the team currently believes to be true but has not yet fully confirmed. They differ from constraints because constraints are known limitations, while assumptions still require verification. If an important assumption is incorrect, it may affect the project’s scope, requirements, design, schedule, cost, quality or security. Material assumptions must therefore be monitored and considered in the Risk Register </w:t>
+      </w:r>
+      <w:sdt>
+        <w:sdtPr>
+          <w:rPr>
+            <w:sz w:val="22"/>
+            <w:lang w:val="en-ZA"/>
+          </w:rPr>
+          <w:id w:val="851463801"/>
+          <w:citation/>
+        </w:sdtPr>
+        <w:sdtContent>
+          <w:r>
+            <w:rPr>
+              <w:sz w:val="22"/>
+              <w:lang w:val="en-ZA"/>
+            </w:rPr>
+            <w:fldChar w:fldCharType="begin"/>
+          </w:r>
+          <w:r>
+            <w:rPr>
+              <w:sz w:val="22"/>
+            </w:rPr>
+            <w:instrText xml:space="preserve"> CITATION Bel6a \l 1033 </w:instrText>
+          </w:r>
+          <w:r>
+            <w:rPr>
+              <w:sz w:val="22"/>
+              <w:lang w:val="en-ZA"/>
+            </w:rPr>
+            <w:fldChar w:fldCharType="separate"/>
+          </w:r>
+          <w:r>
+            <w:rPr>
+              <w:noProof/>
+              <w:sz w:val="22"/>
+            </w:rPr>
+            <w:t>(Belgium Campus ITversity, 2026 a)</w:t>
+          </w:r>
+          <w:r>
+            <w:rPr>
+              <w:sz w:val="22"/>
+              <w:lang w:val="en-ZA"/>
+            </w:rPr>
+            <w:fldChar w:fldCharType="end"/>
+          </w:r>
+        </w:sdtContent>
+      </w:sdt>
+      <w:r>
+        <w:rPr>
+          <w:sz w:val="22"/>
+          <w:lang w:val="en-ZA"/>
+        </w:rPr>
+        <w:t>.</w:t>
       </w:r>
     </w:p>
     <w:p>
@@ -9571,6 +9990,142 @@
         </w:rPr>
         <w:t>These assumptions must be considered when Phase D develops the Risk Register. If an assumption is confirmed, its status and supporting evidence should be updated. If an assumption proves incorrect, the team must assess its effect on the scope, requirements, constraints, risks and related engineering decisions instead of silently changing the baseline.</w:t>
       </w:r>
+    </w:p>
+    <w:p>
+      <w:pPr>
+        <w:rPr>
+          <w:sz w:val="22"/>
+          <w:lang w:val="en-ZA"/>
+        </w:rPr>
+      </w:pPr>
+      <w:r>
+        <w:rPr>
+          <w:sz w:val="22"/>
+          <w:lang w:val="en-ZA"/>
+        </w:rPr>
+        <w:br w:type="page"/>
+      </w:r>
+    </w:p>
+    <w:sdt>
+      <w:sdtPr>
+        <w:id w:val="1076165290"/>
+        <w:docPartObj>
+          <w:docPartGallery w:val="Bibliographies"/>
+          <w:docPartUnique/>
+        </w:docPartObj>
+      </w:sdtPr>
+      <w:sdtEndPr>
+        <w:rPr>
+          <w:rFonts w:ascii="Arial" w:eastAsiaTheme="minorEastAsia" w:hAnsi="Arial" w:cstheme="minorBidi"/>
+          <w:b w:val="0"/>
+          <w:bCs w:val="0"/>
+          <w:sz w:val="20"/>
+          <w:szCs w:val="22"/>
+        </w:rPr>
+      </w:sdtEndPr>
+      <w:sdtContent>
+        <w:p>
+          <w:pPr>
+            <w:pStyle w:val="Heading2"/>
+          </w:pPr>
+          <w:r>
+            <w:t>References</w:t>
+          </w:r>
+        </w:p>
+        <w:sdt>
+          <w:sdtPr>
+            <w:id w:val="-573587230"/>
+            <w:bibliography/>
+          </w:sdtPr>
+          <w:sdtContent>
+            <w:p>
+              <w:pPr>
+                <w:pStyle w:val="Bibliography"/>
+                <w:rPr>
+                  <w:noProof/>
+                  <w:sz w:val="24"/>
+                  <w:szCs w:val="24"/>
+                </w:rPr>
+              </w:pPr>
+              <w:r>
+                <w:fldChar w:fldCharType="begin"/>
+              </w:r>
+              <w:r>
+                <w:instrText xml:space="preserve"> BIBLIOGRAPHY </w:instrText>
+              </w:r>
+              <w:r>
+                <w:fldChar w:fldCharType="separate"/>
+              </w:r>
+              <w:r>
+                <w:rPr>
+                  <w:noProof/>
+                </w:rPr>
+                <w:t xml:space="preserve">Belgium Campus ITversity, 2026 a. </w:t>
+              </w:r>
+              <w:r>
+                <w:rPr>
+                  <w:i/>
+                  <w:iCs/>
+                  <w:noProof/>
+                </w:rPr>
+                <w:t xml:space="preserve">CivicConnect Master Project Brief: Community Service Request Management Platform, </w:t>
+              </w:r>
+              <w:r>
+                <w:rPr>
+                  <w:noProof/>
+                </w:rPr>
+                <w:t>Pretoria: Belgium Campus ITversity.</w:t>
+              </w:r>
+            </w:p>
+            <w:p>
+              <w:pPr>
+                <w:pStyle w:val="Bibliography"/>
+                <w:rPr>
+                  <w:noProof/>
+                </w:rPr>
+              </w:pPr>
+              <w:r>
+                <w:rPr>
+                  <w:noProof/>
+                </w:rPr>
+                <w:t xml:space="preserve">Belgium Campus ITversity, 2026 b. </w:t>
+              </w:r>
+              <w:r>
+                <w:rPr>
+                  <w:i/>
+                  <w:iCs/>
+                  <w:noProof/>
+                </w:rPr>
+                <w:t xml:space="preserve">CivicConnect Project Milestone 1: Engineering Foundation and Requirements Baseline, </w:t>
+              </w:r>
+              <w:r>
+                <w:rPr>
+                  <w:noProof/>
+                </w:rPr>
+                <w:t>s.l.: Belgium Campus ITversity.</w:t>
+              </w:r>
+            </w:p>
+            <w:p>
+              <w:r>
+                <w:rPr>
+                  <w:b/>
+                  <w:bCs/>
+                  <w:noProof/>
+                </w:rPr>
+                <w:fldChar w:fldCharType="end"/>
+              </w:r>
+            </w:p>
+          </w:sdtContent>
+        </w:sdt>
+      </w:sdtContent>
+    </w:sdt>
+    <w:p>
+      <w:pPr>
+        <w:rPr>
+          <w:sz w:val="22"/>
+          <w:lang w:val="en-ZA"/>
+        </w:rPr>
+      </w:pPr>
     </w:p>
     <w:p>
       <w:pPr>
@@ -10196,7 +10751,7 @@
     <w:link w:val="Heading1Char"/>
     <w:uiPriority w:val="9"/>
     <w:qFormat/>
-    <w:rsid w:val="00FC693F"/>
+    <w:rsid w:val="006A0FDA"/>
     <w:pPr>
       <w:keepNext/>
       <w:keepLines/>
@@ -10207,8 +10762,7 @@
       <w:rFonts w:asciiTheme="majorHAnsi" w:eastAsiaTheme="majorEastAsia" w:hAnsiTheme="majorHAnsi" w:cstheme="majorBidi"/>
       <w:b/>
       <w:bCs/>
-      <w:color w:val="365F91" w:themeColor="accent1" w:themeShade="BF"/>
-      <w:sz w:val="28"/>
+      <w:sz w:val="40"/>
       <w:szCs w:val="28"/>
     </w:rPr>
   </w:style>
@@ -10220,7 +10774,7 @@
     <w:uiPriority w:val="9"/>
     <w:unhideWhenUsed/>
     <w:qFormat/>
-    <w:rsid w:val="00FC693F"/>
+    <w:rsid w:val="006A0FDA"/>
     <w:pPr>
       <w:keepNext/>
       <w:keepLines/>
@@ -10231,7 +10785,6 @@
       <w:rFonts w:asciiTheme="majorHAnsi" w:eastAsiaTheme="majorEastAsia" w:hAnsiTheme="majorHAnsi" w:cstheme="majorBidi"/>
       <w:b/>
       <w:bCs/>
-      <w:color w:val="4F81BD" w:themeColor="accent1"/>
       <w:sz w:val="26"/>
       <w:szCs w:val="26"/>
     </w:rPr>
@@ -10481,13 +11034,12 @@
     <w:basedOn w:val="DefaultParagraphFont"/>
     <w:link w:val="Heading1"/>
     <w:uiPriority w:val="9"/>
-    <w:rsid w:val="00FC693F"/>
+    <w:rsid w:val="006A0FDA"/>
     <w:rPr>
       <w:rFonts w:asciiTheme="majorHAnsi" w:eastAsiaTheme="majorEastAsia" w:hAnsiTheme="majorHAnsi" w:cstheme="majorBidi"/>
       <w:b/>
       <w:bCs/>
-      <w:color w:val="365F91" w:themeColor="accent1" w:themeShade="BF"/>
-      <w:sz w:val="28"/>
+      <w:sz w:val="40"/>
       <w:szCs w:val="28"/>
     </w:rPr>
   </w:style>
@@ -10496,12 +11048,11 @@
     <w:basedOn w:val="DefaultParagraphFont"/>
     <w:link w:val="Heading2"/>
     <w:uiPriority w:val="9"/>
-    <w:rsid w:val="00FC693F"/>
+    <w:rsid w:val="006A0FDA"/>
     <w:rPr>
       <w:rFonts w:asciiTheme="majorHAnsi" w:eastAsiaTheme="majorEastAsia" w:hAnsiTheme="majorHAnsi" w:cstheme="majorBidi"/>
       <w:b/>
       <w:bCs/>
-      <w:color w:val="4F81BD" w:themeColor="accent1"/>
       <w:sz w:val="26"/>
       <w:szCs w:val="26"/>
     </w:rPr>
@@ -21176,6 +21727,14 @@
       </w:tcPr>
     </w:tblStylePr>
   </w:style>
+  <w:style w:type="paragraph" w:styleId="Bibliography">
+    <w:name w:val="Bibliography"/>
+    <w:basedOn w:val="Normal"/>
+    <w:next w:val="Normal"/>
+    <w:uiPriority w:val="37"/>
+    <w:unhideWhenUsed/>
+    <w:rsid w:val="00CD4C28"/>
+  </w:style>
 </w:styles>
 </file>
 
@@ -21500,11 +22059,41 @@
 </file>
 
 <file path=customXml/item1.xml><?xml version="1.0" encoding="utf-8"?>
-<b:Sources xmlns:b="http://schemas.openxmlformats.org/officeDocument/2006/bibliography" xmlns="http://schemas.openxmlformats.org/officeDocument/2006/bibliography" SelectedStyle="\HarvardAnglia2008OfficeOnline.xsl" StyleName="Harvard - Anglia" Version="2008"/>
+<b:Sources xmlns:b="http://schemas.openxmlformats.org/officeDocument/2006/bibliography" xmlns="http://schemas.openxmlformats.org/officeDocument/2006/bibliography" SelectedStyle="\HarvardAnglia2008OfficeOnline.xsl" StyleName="Harvard - Anglia" Version="2008">
+  <b:Source>
+    <b:Tag>Bel6a</b:Tag>
+    <b:SourceType>Report</b:SourceType>
+    <b:Guid>{02EBBC75-A393-40EB-80D3-88C211EB0BD9}</b:Guid>
+    <b:Title>CivicConnect Master Project Brief: Community Service Request Management Platform</b:Title>
+    <b:Year>2026 a</b:Year>
+    <b:Author>
+      <b:Author>
+        <b:Corporate>Belgium Campus ITversity</b:Corporate>
+      </b:Author>
+    </b:Author>
+    <b:Publisher>Belgium Campus ITversity</b:Publisher>
+    <b:City>Pretoria</b:City>
+    <b:RefOrder>1</b:RefOrder>
+  </b:Source>
+  <b:Source>
+    <b:Tag>Bel6b</b:Tag>
+    <b:SourceType>Report</b:SourceType>
+    <b:Guid>{92F8160C-7977-4D76-88E5-B7DA18B4593C}</b:Guid>
+    <b:Author>
+      <b:Author>
+        <b:Corporate>Belgium Campus ITversity</b:Corporate>
+      </b:Author>
+    </b:Author>
+    <b:Title>CivicConnect Project Milestone 1: Engineering Foundation and Requirements Baseline</b:Title>
+    <b:Year>2026 b</b:Year>
+    <b:Publisher>Belgium Campus ITversity</b:Publisher>
+    <b:RefOrder>2</b:RefOrder>
+  </b:Source>
+</b:Sources>
 </file>
 
 <file path=customXml/itemProps1.xml><?xml version="1.0" encoding="utf-8"?>
-<ds:datastoreItem xmlns:ds="http://schemas.openxmlformats.org/officeDocument/2006/customXml" ds:itemID="{4292217C-F444-4268-B5B9-E9A77F231BBB}">
+<ds:datastoreItem xmlns:ds="http://schemas.openxmlformats.org/officeDocument/2006/customXml" ds:itemID="{D0B805AE-A0E3-4053-8D94-D7AA4ED15CC2}">
   <ds:schemaRefs>
     <ds:schemaRef ds:uri="http://schemas.openxmlformats.org/officeDocument/2006/bibliography"/>
   </ds:schemaRefs>

</xml_diff>

<commit_message>
Complete Phase B requirements review
</commit_message>
<xml_diff>
--- a/docs/PED/Phase-B.docx
+++ b/docs/PED/Phase-B.docx
@@ -36,7 +36,6 @@
         <w:spacing w:after="120" w:line="259" w:lineRule="auto"/>
         <w:rPr>
           <w:rFonts w:cs="Arial"/>
-          <w:sz w:val="22"/>
           <w:lang w:val="en-ZA"/>
         </w:rPr>
       </w:pPr>
@@ -44,7 +43,6 @@
         <w:rPr>
           <w:rFonts w:cs="Arial"/>
           <w:color w:val="000000"/>
-          <w:sz w:val="22"/>
           <w:lang w:val="en-ZA"/>
         </w:rPr>
         <w:t>CivicConnect addresses the problems caused by managing community service requests through disconnected channels such as email, telephone calls, WhatsApp, spreadsheets and paper records. This fragmented process can result in requests being duplicated, overlooked, incorrectly assigned or lost. Requesters have limited visibility of their requests, staff struggle to prioritise and coordinate work, and management lacks reliable information for monitoring service performance and accountability</w:t>
@@ -53,7 +51,6 @@
         <w:rPr>
           <w:rFonts w:cs="Arial"/>
           <w:color w:val="000000"/>
-          <w:sz w:val="22"/>
           <w:lang w:val="en-ZA"/>
         </w:rPr>
         <w:t xml:space="preserve"> </w:t>
@@ -63,7 +60,6 @@
           <w:rPr>
             <w:rFonts w:cs="Arial"/>
             <w:color w:val="000000"/>
-            <w:sz w:val="22"/>
             <w:lang w:val="en-ZA"/>
           </w:rPr>
           <w:id w:val="-32734396"/>
@@ -74,7 +70,6 @@
             <w:rPr>
               <w:rFonts w:cs="Arial"/>
               <w:color w:val="000000"/>
-              <w:sz w:val="22"/>
               <w:lang w:val="en-ZA"/>
             </w:rPr>
             <w:fldChar w:fldCharType="begin"/>
@@ -83,7 +78,6 @@
             <w:rPr>
               <w:rFonts w:cs="Arial"/>
               <w:color w:val="000000"/>
-              <w:sz w:val="22"/>
             </w:rPr>
             <w:instrText xml:space="preserve"> CITATION Bel6a \l 1033 </w:instrText>
           </w:r>
@@ -91,7 +85,6 @@
             <w:rPr>
               <w:rFonts w:cs="Arial"/>
               <w:color w:val="000000"/>
-              <w:sz w:val="22"/>
               <w:lang w:val="en-ZA"/>
             </w:rPr>
             <w:fldChar w:fldCharType="separate"/>
@@ -101,7 +94,6 @@
               <w:rFonts w:cs="Arial"/>
               <w:noProof/>
               <w:color w:val="000000"/>
-              <w:sz w:val="22"/>
             </w:rPr>
             <w:t>(Belgium Campus ITversity, 2026 a)</w:t>
           </w:r>
@@ -109,7 +101,6 @@
             <w:rPr>
               <w:rFonts w:cs="Arial"/>
               <w:color w:val="000000"/>
-              <w:sz w:val="22"/>
               <w:lang w:val="en-ZA"/>
             </w:rPr>
             <w:fldChar w:fldCharType="end"/>
@@ -120,7 +111,6 @@
         <w:rPr>
           <w:rFonts w:cs="Arial"/>
           <w:color w:val="000000"/>
-          <w:sz w:val="22"/>
           <w:lang w:val="en-ZA"/>
         </w:rPr>
         <w:t>.</w:t>
@@ -131,7 +121,6 @@
         <w:spacing w:after="120" w:line="259" w:lineRule="auto"/>
         <w:rPr>
           <w:rFonts w:cs="Arial"/>
-          <w:sz w:val="22"/>
           <w:lang w:val="en-ZA"/>
         </w:rPr>
       </w:pPr>
@@ -139,7 +128,6 @@
         <w:rPr>
           <w:rFonts w:cs="Arial"/>
           <w:color w:val="000000"/>
-          <w:sz w:val="22"/>
           <w:lang w:val="en-ZA"/>
         </w:rPr>
         <w:t>The organisation therefore needs a controlled digital platform for submitting, managing, monitoring and reporting on service requests. CivicConnect will provide a single, traceable record of each request throughout its lifecycle. Its intended business value is to improve visibility, coordination, accountability and reporting without creating an unsustainable technical, operational or financial burden.</w:t>
@@ -157,7 +145,6 @@
         <w:rPr>
           <w:b/>
           <w:color w:val="000000"/>
-          <w:sz w:val="22"/>
           <w:lang w:val="en-ZA"/>
         </w:rPr>
         <w:t>Stakeholder and Business-Value Link</w:t>
@@ -205,7 +192,6 @@
           <w:p>
             <w:pPr>
               <w:rPr>
-                <w:sz w:val="22"/>
                 <w:lang w:val="en-ZA"/>
               </w:rPr>
             </w:pPr>
@@ -213,7 +199,6 @@
               <w:rPr>
                 <w:b/>
                 <w:color w:val="000000"/>
-                <w:sz w:val="22"/>
                 <w:lang w:val="en-ZA"/>
               </w:rPr>
               <w:t>Stakeholder</w:t>
@@ -235,7 +220,6 @@
           <w:p>
             <w:pPr>
               <w:rPr>
-                <w:sz w:val="22"/>
                 <w:lang w:val="en-ZA"/>
               </w:rPr>
             </w:pPr>
@@ -243,7 +227,6 @@
               <w:rPr>
                 <w:b/>
                 <w:color w:val="000000"/>
-                <w:sz w:val="22"/>
                 <w:lang w:val="en-ZA"/>
               </w:rPr>
               <w:t>Current problem</w:t>
@@ -265,7 +248,6 @@
           <w:p>
             <w:pPr>
               <w:rPr>
-                <w:sz w:val="22"/>
                 <w:lang w:val="en-ZA"/>
               </w:rPr>
             </w:pPr>
@@ -273,7 +255,6 @@
               <w:rPr>
                 <w:b/>
                 <w:color w:val="000000"/>
-                <w:sz w:val="22"/>
                 <w:lang w:val="en-ZA"/>
               </w:rPr>
               <w:t>Intended value</w:t>
@@ -639,14 +620,12 @@
       <w:pPr>
         <w:spacing w:after="120" w:line="259" w:lineRule="auto"/>
         <w:rPr>
-          <w:sz w:val="22"/>
           <w:lang w:val="en-ZA"/>
         </w:rPr>
       </w:pPr>
       <w:r>
         <w:rPr>
           <w:color w:val="000000"/>
-          <w:sz w:val="22"/>
           <w:lang w:val="en-ZA"/>
         </w:rPr>
         <w:t>The stakeholder analysis identifies the people and groups who use, manage, support or are affected by CivicConnect. Their needs and expectations provide the basis for defining the project scope and requirements. The main stakeholder groups were identified from the project scenario and minimum business capabilities in the Master Project Brief</w:t>
@@ -654,7 +633,6 @@
       <w:r>
         <w:rPr>
           <w:color w:val="000000"/>
-          <w:sz w:val="22"/>
           <w:lang w:val="en-ZA"/>
         </w:rPr>
         <w:t xml:space="preserve"> </w:t>
@@ -663,7 +641,6 @@
         <w:sdtPr>
           <w:rPr>
             <w:color w:val="000000"/>
-            <w:sz w:val="22"/>
             <w:lang w:val="en-ZA"/>
           </w:rPr>
           <w:id w:val="532923673"/>
@@ -673,7 +650,6 @@
           <w:r>
             <w:rPr>
               <w:color w:val="000000"/>
-              <w:sz w:val="22"/>
               <w:lang w:val="en-ZA"/>
             </w:rPr>
             <w:fldChar w:fldCharType="begin"/>
@@ -681,14 +657,12 @@
           <w:r>
             <w:rPr>
               <w:color w:val="000000"/>
-              <w:sz w:val="22"/>
             </w:rPr>
             <w:instrText xml:space="preserve"> CITATION Bel6a \l 1033 </w:instrText>
           </w:r>
           <w:r>
             <w:rPr>
               <w:color w:val="000000"/>
-              <w:sz w:val="22"/>
               <w:lang w:val="en-ZA"/>
             </w:rPr>
             <w:fldChar w:fldCharType="separate"/>
@@ -697,14 +671,12 @@
             <w:rPr>
               <w:noProof/>
               <w:color w:val="000000"/>
-              <w:sz w:val="22"/>
             </w:rPr>
             <w:t>(Belgium Campus ITversity, 2026 a)</w:t>
           </w:r>
           <w:r>
             <w:rPr>
               <w:color w:val="000000"/>
-              <w:sz w:val="22"/>
               <w:lang w:val="en-ZA"/>
             </w:rPr>
             <w:fldChar w:fldCharType="end"/>
@@ -714,7 +686,6 @@
       <w:r>
         <w:rPr>
           <w:color w:val="000000"/>
-          <w:sz w:val="22"/>
           <w:lang w:val="en-ZA"/>
         </w:rPr>
         <w:t>.</w:t>
@@ -732,7 +703,6 @@
         <w:rPr>
           <w:b/>
           <w:color w:val="000000"/>
-          <w:sz w:val="22"/>
           <w:lang w:val="en-ZA"/>
         </w:rPr>
         <w:t>Stakeholder Register</w:t>
@@ -783,7 +753,6 @@
           <w:p>
             <w:pPr>
               <w:rPr>
-                <w:sz w:val="22"/>
                 <w:lang w:val="en-ZA"/>
               </w:rPr>
             </w:pPr>
@@ -791,7 +760,6 @@
               <w:rPr>
                 <w:b/>
                 <w:color w:val="000000"/>
-                <w:sz w:val="22"/>
                 <w:lang w:val="en-ZA"/>
               </w:rPr>
               <w:t>ID</w:t>
@@ -813,7 +781,6 @@
           <w:p>
             <w:pPr>
               <w:rPr>
-                <w:sz w:val="22"/>
                 <w:lang w:val="en-ZA"/>
               </w:rPr>
             </w:pPr>
@@ -821,7 +788,6 @@
               <w:rPr>
                 <w:b/>
                 <w:color w:val="000000"/>
-                <w:sz w:val="22"/>
                 <w:lang w:val="en-ZA"/>
               </w:rPr>
               <w:t>Stakeholder</w:t>
@@ -843,7 +809,6 @@
           <w:p>
             <w:pPr>
               <w:rPr>
-                <w:sz w:val="22"/>
                 <w:lang w:val="en-ZA"/>
               </w:rPr>
             </w:pPr>
@@ -851,7 +816,6 @@
               <w:rPr>
                 <w:b/>
                 <w:color w:val="000000"/>
-                <w:sz w:val="22"/>
                 <w:lang w:val="en-ZA"/>
               </w:rPr>
               <w:t>Role and interest</w:t>
@@ -873,7 +837,6 @@
           <w:p>
             <w:pPr>
               <w:rPr>
-                <w:sz w:val="22"/>
                 <w:lang w:val="en-ZA"/>
               </w:rPr>
             </w:pPr>
@@ -881,7 +844,6 @@
               <w:rPr>
                 <w:b/>
                 <w:color w:val="000000"/>
-                <w:sz w:val="22"/>
                 <w:lang w:val="en-ZA"/>
               </w:rPr>
               <w:t>Main needs and expectations</w:t>
@@ -903,7 +865,6 @@
           <w:p>
             <w:pPr>
               <w:rPr>
-                <w:sz w:val="22"/>
                 <w:lang w:val="en-ZA"/>
               </w:rPr>
             </w:pPr>
@@ -911,7 +872,6 @@
               <w:rPr>
                 <w:b/>
                 <w:color w:val="000000"/>
-                <w:sz w:val="22"/>
                 <w:lang w:val="en-ZA"/>
               </w:rPr>
               <w:t>Influence</w:t>
@@ -933,7 +893,6 @@
           <w:p>
             <w:pPr>
               <w:rPr>
-                <w:sz w:val="22"/>
                 <w:lang w:val="en-ZA"/>
               </w:rPr>
             </w:pPr>
@@ -941,7 +900,6 @@
               <w:rPr>
                 <w:b/>
                 <w:color w:val="000000"/>
-                <w:sz w:val="22"/>
                 <w:lang w:val="en-ZA"/>
               </w:rPr>
               <w:t>Interest</w:t>
@@ -1748,14 +1706,12 @@
       <w:pPr>
         <w:spacing w:after="120" w:line="259" w:lineRule="auto"/>
         <w:rPr>
-          <w:sz w:val="22"/>
           <w:lang w:val="en-ZA"/>
         </w:rPr>
       </w:pPr>
       <w:r>
         <w:rPr>
           <w:color w:val="000000"/>
-          <w:sz w:val="22"/>
           <w:lang w:val="en-ZA"/>
         </w:rPr>
         <w:lastRenderedPageBreak/>
@@ -1774,7 +1730,6 @@
         <w:rPr>
           <w:b/>
           <w:color w:val="000000"/>
-          <w:sz w:val="22"/>
           <w:lang w:val="en-ZA"/>
         </w:rPr>
         <w:t>Stakeholder Conflicts and Competing Expectations</w:t>
@@ -1822,7 +1777,6 @@
           <w:p>
             <w:pPr>
               <w:rPr>
-                <w:sz w:val="22"/>
                 <w:lang w:val="en-ZA"/>
               </w:rPr>
             </w:pPr>
@@ -1830,7 +1784,6 @@
               <w:rPr>
                 <w:b/>
                 <w:color w:val="000000"/>
-                <w:sz w:val="22"/>
                 <w:lang w:val="en-ZA"/>
               </w:rPr>
               <w:t>Stakeholders involved</w:t>
@@ -1852,7 +1805,6 @@
           <w:p>
             <w:pPr>
               <w:rPr>
-                <w:sz w:val="22"/>
                 <w:lang w:val="en-ZA"/>
               </w:rPr>
             </w:pPr>
@@ -1860,7 +1812,6 @@
               <w:rPr>
                 <w:b/>
                 <w:color w:val="000000"/>
-                <w:sz w:val="22"/>
                 <w:lang w:val="en-ZA"/>
               </w:rPr>
               <w:t>Conflict or competing expectation</w:t>
@@ -1882,7 +1833,6 @@
           <w:p>
             <w:pPr>
               <w:rPr>
-                <w:sz w:val="22"/>
                 <w:lang w:val="en-ZA"/>
               </w:rPr>
             </w:pPr>
@@ -1890,7 +1840,6 @@
               <w:rPr>
                 <w:b/>
                 <w:color w:val="000000"/>
-                <w:sz w:val="22"/>
                 <w:lang w:val="en-ZA"/>
               </w:rPr>
               <w:t>Effect on the project</w:t>
@@ -2271,7 +2220,6 @@
         <w:rPr>
           <w:b/>
           <w:color w:val="000000"/>
-          <w:sz w:val="22"/>
           <w:lang w:val="en-ZA"/>
         </w:rPr>
         <w:t>Examples of Requirements Derived from Stakeholder Needs</w:t>
@@ -2320,7 +2268,6 @@
           <w:p>
             <w:pPr>
               <w:rPr>
-                <w:sz w:val="22"/>
                 <w:lang w:val="en-ZA"/>
               </w:rPr>
             </w:pPr>
@@ -2328,7 +2275,6 @@
               <w:rPr>
                 <w:b/>
                 <w:color w:val="000000"/>
-                <w:sz w:val="22"/>
                 <w:lang w:val="en-ZA"/>
               </w:rPr>
               <w:t>Requirement ID</w:t>
@@ -2350,7 +2296,6 @@
           <w:p>
             <w:pPr>
               <w:rPr>
-                <w:sz w:val="22"/>
                 <w:lang w:val="en-ZA"/>
               </w:rPr>
             </w:pPr>
@@ -2358,7 +2303,6 @@
               <w:rPr>
                 <w:b/>
                 <w:color w:val="000000"/>
-                <w:sz w:val="22"/>
                 <w:lang w:val="en-ZA"/>
               </w:rPr>
               <w:t>Stakeholder source</w:t>
@@ -2380,7 +2324,6 @@
           <w:p>
             <w:pPr>
               <w:rPr>
-                <w:sz w:val="22"/>
                 <w:lang w:val="en-ZA"/>
               </w:rPr>
             </w:pPr>
@@ -2388,7 +2331,6 @@
               <w:rPr>
                 <w:b/>
                 <w:color w:val="000000"/>
-                <w:sz w:val="22"/>
                 <w:lang w:val="en-ZA"/>
               </w:rPr>
               <w:t>Identified need</w:t>
@@ -2410,7 +2352,6 @@
           <w:p>
             <w:pPr>
               <w:rPr>
-                <w:sz w:val="22"/>
                 <w:lang w:val="en-ZA"/>
               </w:rPr>
             </w:pPr>
@@ -2418,7 +2359,6 @@
               <w:rPr>
                 <w:b/>
                 <w:color w:val="000000"/>
-                <w:sz w:val="22"/>
                 <w:lang w:val="en-ZA"/>
               </w:rPr>
               <w:t>Derived requirement</w:t>
@@ -2975,16 +2915,15 @@
       <w:pPr>
         <w:spacing w:after="120" w:line="259" w:lineRule="auto"/>
         <w:rPr>
-          <w:sz w:val="22"/>
           <w:lang w:val="en-ZA"/>
         </w:rPr>
       </w:pPr>
       <w:r>
         <w:rPr>
           <w:color w:val="000000"/>
-          <w:sz w:val="22"/>
           <w:lang w:val="en-ZA"/>
         </w:rPr>
+        <w:lastRenderedPageBreak/>
         <w:t>These requirement examples establish the connection between stakeholder needs and Phase C. Their identifiers, priority, acceptance criteria and later traceability evidence must remain consistent in the requirements baseline and Requirements Traceability Matrix.</w:t>
       </w:r>
     </w:p>
@@ -2999,7 +2938,6 @@
         <w:rPr>
           <w:lang w:val="en-ZA"/>
         </w:rPr>
-        <w:lastRenderedPageBreak/>
         <w:t>M1-03: Scope Baseline</w:t>
       </w:r>
     </w:p>
@@ -3007,14 +2945,12 @@
       <w:pPr>
         <w:spacing w:after="120" w:line="259" w:lineRule="auto"/>
         <w:rPr>
-          <w:sz w:val="22"/>
           <w:lang w:val="en-ZA"/>
         </w:rPr>
       </w:pPr>
       <w:r>
         <w:rPr>
           <w:color w:val="000000"/>
-          <w:sz w:val="22"/>
           <w:lang w:val="en-ZA"/>
         </w:rPr>
         <w:t>The CivicConnect scope baseline defines the capabilities that the team commits to delivering and establishes boundaries to prevent uncontrolled scope growth. It is based on the minimum business capabilities specified in the Master Project Brief and the needs of the stakeholders identified in M1-02</w:t>
@@ -3022,7 +2958,6 @@
       <w:r>
         <w:rPr>
           <w:color w:val="000000"/>
-          <w:sz w:val="22"/>
           <w:lang w:val="en-ZA"/>
         </w:rPr>
         <w:t xml:space="preserve">. </w:t>
@@ -3030,7 +2965,6 @@
       <w:r>
         <w:rPr>
           <w:color w:val="000000"/>
-          <w:sz w:val="22"/>
           <w:lang w:val="en-ZA"/>
         </w:rPr>
         <w:t>Any change to the approved scope must be assessed, recorded and approved through the project’s change-control process</w:t>
@@ -3038,7 +2972,6 @@
       <w:r>
         <w:rPr>
           <w:color w:val="000000"/>
-          <w:sz w:val="22"/>
           <w:lang w:val="en-ZA"/>
         </w:rPr>
         <w:t xml:space="preserve"> </w:t>
@@ -3047,7 +2980,6 @@
         <w:sdtPr>
           <w:rPr>
             <w:color w:val="000000"/>
-            <w:sz w:val="22"/>
             <w:lang w:val="en-ZA"/>
           </w:rPr>
           <w:id w:val="-1186745632"/>
@@ -3057,7 +2989,6 @@
           <w:r>
             <w:rPr>
               <w:color w:val="000000"/>
-              <w:sz w:val="22"/>
               <w:lang w:val="en-ZA"/>
             </w:rPr>
             <w:fldChar w:fldCharType="begin"/>
@@ -3065,14 +2996,12 @@
           <w:r>
             <w:rPr>
               <w:color w:val="000000"/>
-              <w:sz w:val="22"/>
             </w:rPr>
             <w:instrText xml:space="preserve"> CITATION Bel6a \l 1033 </w:instrText>
           </w:r>
           <w:r>
             <w:rPr>
               <w:color w:val="000000"/>
-              <w:sz w:val="22"/>
               <w:lang w:val="en-ZA"/>
             </w:rPr>
             <w:fldChar w:fldCharType="separate"/>
@@ -3081,14 +3010,12 @@
             <w:rPr>
               <w:noProof/>
               <w:color w:val="000000"/>
-              <w:sz w:val="22"/>
             </w:rPr>
             <w:t>(Belgium Campus ITversity, 2026 a)</w:t>
           </w:r>
           <w:r>
             <w:rPr>
               <w:color w:val="000000"/>
-              <w:sz w:val="22"/>
               <w:lang w:val="en-ZA"/>
             </w:rPr>
             <w:fldChar w:fldCharType="end"/>
@@ -3098,7 +3025,6 @@
       <w:r>
         <w:rPr>
           <w:color w:val="000000"/>
-          <w:sz w:val="22"/>
           <w:lang w:val="en-ZA"/>
         </w:rPr>
         <w:t>.</w:t>
@@ -3116,7 +3042,6 @@
         <w:rPr>
           <w:b/>
           <w:color w:val="000000"/>
-          <w:sz w:val="22"/>
           <w:lang w:val="en-ZA"/>
         </w:rPr>
         <w:t>In-Scope Capabilities</w:t>
@@ -3164,7 +3089,6 @@
           <w:p>
             <w:pPr>
               <w:rPr>
-                <w:sz w:val="22"/>
                 <w:lang w:val="en-ZA"/>
               </w:rPr>
             </w:pPr>
@@ -3172,7 +3096,6 @@
               <w:rPr>
                 <w:b/>
                 <w:color w:val="000000"/>
-                <w:sz w:val="22"/>
                 <w:lang w:val="en-ZA"/>
               </w:rPr>
               <w:t>Scope ID</w:t>
@@ -3194,7 +3117,6 @@
           <w:p>
             <w:pPr>
               <w:rPr>
-                <w:sz w:val="22"/>
                 <w:lang w:val="en-ZA"/>
               </w:rPr>
             </w:pPr>
@@ -3202,7 +3124,6 @@
               <w:rPr>
                 <w:b/>
                 <w:color w:val="000000"/>
-                <w:sz w:val="22"/>
                 <w:lang w:val="en-ZA"/>
               </w:rPr>
               <w:t>In-scope capability</w:t>
@@ -3224,7 +3145,6 @@
           <w:p>
             <w:pPr>
               <w:rPr>
-                <w:sz w:val="22"/>
                 <w:lang w:val="en-ZA"/>
               </w:rPr>
             </w:pPr>
@@ -3232,7 +3152,6 @@
               <w:rPr>
                 <w:b/>
                 <w:color w:val="000000"/>
-                <w:sz w:val="22"/>
                 <w:lang w:val="en-ZA"/>
               </w:rPr>
               <w:t>Primary stakeholder</w:t>
@@ -4576,6 +4495,7 @@
               <w:rPr>
                 <w:lang w:val="en-ZA"/>
               </w:rPr>
+              <w:lastRenderedPageBreak/>
               <w:t>SC-017</w:t>
             </w:r>
           </w:p>
@@ -4637,14 +4557,12 @@
         <w:spacing w:after="120" w:line="259" w:lineRule="auto"/>
         <w:rPr>
           <w:color w:val="000000"/>
-          <w:sz w:val="22"/>
           <w:lang w:val="en-ZA"/>
         </w:rPr>
       </w:pPr>
       <w:r>
         <w:rPr>
           <w:color w:val="000000"/>
-          <w:sz w:val="22"/>
           <w:lang w:val="en-ZA"/>
         </w:rPr>
         <w:t>The feedback included in the current scope may be provided within CivicConnect. Integration with external communication services is not required for the initial project baseline.</w:t>
@@ -4654,14 +4572,12 @@
       <w:pPr>
         <w:rPr>
           <w:color w:val="000000"/>
-          <w:sz w:val="22"/>
           <w:lang w:val="en-ZA"/>
         </w:rPr>
       </w:pPr>
       <w:r>
         <w:rPr>
           <w:color w:val="000000"/>
-          <w:sz w:val="22"/>
           <w:lang w:val="en-ZA"/>
         </w:rPr>
         <w:br w:type="page"/>
@@ -4669,12 +4585,41 @@
     </w:p>
     <w:p>
       <w:pPr>
-        <w:spacing w:after="120" w:line="259" w:lineRule="auto"/>
         <w:rPr>
-          <w:sz w:val="22"/>
+          <w:b/>
+          <w:bCs/>
+        </w:rPr>
+      </w:pPr>
+      <w:r>
+        <w:rPr>
+          <w:b/>
+          <w:bCs/>
+        </w:rPr>
+        <w:lastRenderedPageBreak/>
+        <w:t>System Boundary</w:t>
+      </w:r>
+    </w:p>
+    <w:p>
+      <w:pPr>
+        <w:rPr>
+          <w:sz w:val="20"/>
           <w:lang w:val="en-ZA"/>
         </w:rPr>
       </w:pPr>
+      <w:proofErr w:type="spellStart"/>
+      <w:r>
+        <w:rPr>
+          <w:lang w:val="en-ZA"/>
+        </w:rPr>
+        <w:t>CivicConnect</w:t>
+      </w:r>
+      <w:proofErr w:type="spellEnd"/>
+      <w:r>
+        <w:rPr>
+          <w:lang w:val="en-ZA"/>
+        </w:rPr>
+        <w:t xml:space="preserve"> will allow users to submit, categorise, assign, track and manage community service requests. It will also allow management to monitor requests and view reports. The system will only manage the request and its information; it will not carry out the actual service or repair. Emergency services, unrelated organisational processes and features deferred to a later stage are outside the current system boundary.</w:t>
+      </w:r>
     </w:p>
     <w:p>
       <w:pPr>
@@ -4688,7 +4633,6 @@
         <w:rPr>
           <w:b/>
           <w:color w:val="000000"/>
-          <w:sz w:val="22"/>
           <w:lang w:val="en-ZA"/>
         </w:rPr>
         <w:t>Out-of-Scope Items</w:t>
@@ -4736,7 +4680,6 @@
           <w:p>
             <w:pPr>
               <w:rPr>
-                <w:sz w:val="22"/>
                 <w:lang w:val="en-ZA"/>
               </w:rPr>
             </w:pPr>
@@ -4744,7 +4687,6 @@
               <w:rPr>
                 <w:b/>
                 <w:color w:val="000000"/>
-                <w:sz w:val="22"/>
                 <w:lang w:val="en-ZA"/>
               </w:rPr>
               <w:t>Scope ID</w:t>
@@ -4766,7 +4708,6 @@
           <w:p>
             <w:pPr>
               <w:rPr>
-                <w:sz w:val="22"/>
                 <w:lang w:val="en-ZA"/>
               </w:rPr>
             </w:pPr>
@@ -4774,7 +4715,6 @@
               <w:rPr>
                 <w:b/>
                 <w:color w:val="000000"/>
-                <w:sz w:val="22"/>
                 <w:lang w:val="en-ZA"/>
               </w:rPr>
               <w:t>Out-of-scope item</w:t>
@@ -4796,7 +4736,6 @@
           <w:p>
             <w:pPr>
               <w:rPr>
-                <w:sz w:val="22"/>
                 <w:lang w:val="en-ZA"/>
               </w:rPr>
             </w:pPr>
@@ -4804,7 +4743,6 @@
               <w:rPr>
                 <w:b/>
                 <w:color w:val="000000"/>
-                <w:sz w:val="22"/>
                 <w:lang w:val="en-ZA"/>
               </w:rPr>
               <w:t>Reason</w:t>
@@ -5230,7 +5168,6 @@
         <w:rPr>
           <w:b/>
           <w:color w:val="000000"/>
-          <w:sz w:val="22"/>
           <w:lang w:val="en-ZA"/>
         </w:rPr>
         <w:t>Deferred or Future Scope</w:t>
@@ -5278,7 +5215,6 @@
           <w:p>
             <w:pPr>
               <w:rPr>
-                <w:sz w:val="22"/>
                 <w:lang w:val="en-ZA"/>
               </w:rPr>
             </w:pPr>
@@ -5286,7 +5222,6 @@
               <w:rPr>
                 <w:b/>
                 <w:color w:val="000000"/>
-                <w:sz w:val="22"/>
                 <w:lang w:val="en-ZA"/>
               </w:rPr>
               <w:t>Scope ID</w:t>
@@ -5308,7 +5243,6 @@
           <w:p>
             <w:pPr>
               <w:rPr>
-                <w:sz w:val="22"/>
                 <w:lang w:val="en-ZA"/>
               </w:rPr>
             </w:pPr>
@@ -5316,7 +5250,6 @@
               <w:rPr>
                 <w:b/>
                 <w:color w:val="000000"/>
-                <w:sz w:val="22"/>
                 <w:lang w:val="en-ZA"/>
               </w:rPr>
               <w:t>Deferred capability</w:t>
@@ -5338,7 +5271,6 @@
           <w:p>
             <w:pPr>
               <w:rPr>
-                <w:sz w:val="22"/>
                 <w:lang w:val="en-ZA"/>
               </w:rPr>
             </w:pPr>
@@ -5346,7 +5278,6 @@
               <w:rPr>
                 <w:b/>
                 <w:color w:val="000000"/>
-                <w:sz w:val="22"/>
                 <w:lang w:val="en-ZA"/>
               </w:rPr>
               <w:t>Reason for deferment</w:t>
@@ -5866,6 +5797,7 @@
               <w:rPr>
                 <w:lang w:val="en-ZA"/>
               </w:rPr>
+              <w:lastRenderedPageBreak/>
               <w:t>FS-007</w:t>
             </w:r>
           </w:p>
@@ -5934,7 +5866,6 @@
         <w:rPr>
           <w:b/>
           <w:color w:val="000000"/>
-          <w:sz w:val="22"/>
           <w:lang w:val="en-ZA"/>
         </w:rPr>
         <w:t>Deliberate Deferment Decision</w:t>
@@ -5943,13 +5874,11 @@
     <w:p>
       <w:pPr>
         <w:rPr>
-          <w:sz w:val="22"/>
           <w:lang w:val="en-ZA"/>
         </w:rPr>
       </w:pPr>
       <w:r>
         <w:rPr>
-          <w:sz w:val="22"/>
           <w:lang w:val="en-ZA"/>
         </w:rPr>
         <w:t>The team has deliberately deferred a separate native mobile application from the current project scope. The Master Project Brief requires the core service-request capabilities but does not require a native mobile application. Building and testing separate mobile applications would increase the workload for a three-person team and could reduce the time available for completing and verifying the mandatory capabilities. The team will therefore prioritise a complete, controlled and testable core platform. A native mobile application may be reconsidered later if stakeholder evidence shows that it is necessary and the available schedule and resources can support it.</w:t>
@@ -5959,18 +5888,45 @@
       <w:pPr>
         <w:spacing w:after="120" w:line="259" w:lineRule="auto"/>
         <w:rPr>
-          <w:sz w:val="22"/>
+          <w:color w:val="000000"/>
           <w:lang w:val="en-ZA"/>
         </w:rPr>
       </w:pPr>
       <w:r>
         <w:rPr>
           <w:color w:val="000000"/>
-          <w:sz w:val="22"/>
           <w:lang w:val="en-ZA"/>
         </w:rPr>
-        <w:lastRenderedPageBreak/>
         <w:t>External messaging integrations have also been deferred. CivicConnect will still provide meaningful request feedback within the platform, while WhatsApp, SMS or external email notifications can be considered later after their cost, security, privacy and integration implications have been investigated.</w:t>
+      </w:r>
+    </w:p>
+    <w:p>
+      <w:pPr>
+        <w:rPr>
+          <w:b/>
+          <w:bCs/>
+        </w:rPr>
+      </w:pPr>
+      <w:r>
+        <w:rPr>
+          <w:b/>
+          <w:bCs/>
+        </w:rPr>
+        <w:t>Major Scope Dependencies</w:t>
+      </w:r>
+    </w:p>
+    <w:p>
+      <w:pPr>
+        <w:rPr>
+          <w:sz w:val="20"/>
+          <w:lang w:val="en-ZA"/>
+        </w:rPr>
+      </w:pPr>
+      <w:r>
+        <w:rPr>
+          <w:lang w:val="en-ZA"/>
+        </w:rPr>
+        <w:t>The scope depends on the organisation confirming the request categories, request statuses and user roles. It also depends on stakeholders being available to confirm the requirements, staff keeping request information updated and the selected low-cost services supporting the expected number of users and requests. These dependencies are recorded in ASM-002 to ASM-008. If any of them change, the team must check how the scope and related requirements are affected and record the change.</w:t>
       </w:r>
     </w:p>
     <w:p>
@@ -5985,7 +5941,6 @@
         <w:rPr>
           <w:b/>
           <w:color w:val="000000"/>
-          <w:sz w:val="22"/>
           <w:lang w:val="en-ZA"/>
         </w:rPr>
         <w:t>Scope Control</w:t>
@@ -5996,14 +5951,12 @@
         <w:spacing w:after="120" w:line="259" w:lineRule="auto"/>
         <w:rPr>
           <w:color w:val="000000"/>
-          <w:sz w:val="22"/>
           <w:lang w:val="en-ZA"/>
         </w:rPr>
       </w:pPr>
       <w:r>
         <w:rPr>
           <w:color w:val="000000"/>
-          <w:sz w:val="22"/>
           <w:lang w:val="en-ZA"/>
         </w:rPr>
         <w:t>This scope statement forms the proposed M1 baseline. Once it has been reviewed and signed off by the team, items may not be added, removed or changed informally. Any proposed change must identify the affected requirements and consider its effect on schedule, cost, resources, quality, security, risk, testing and later project artefacts, as required by the Milestone 1 scope-control standard</w:t>
@@ -6011,7 +5964,6 @@
       <w:r>
         <w:rPr>
           <w:color w:val="000000"/>
-          <w:sz w:val="22"/>
           <w:lang w:val="en-ZA"/>
         </w:rPr>
         <w:t xml:space="preserve"> </w:t>
@@ -6020,7 +5972,6 @@
         <w:sdtPr>
           <w:rPr>
             <w:color w:val="000000"/>
-            <w:sz w:val="22"/>
             <w:lang w:val="en-ZA"/>
           </w:rPr>
           <w:id w:val="1642075150"/>
@@ -6030,7 +5981,6 @@
           <w:r>
             <w:rPr>
               <w:color w:val="000000"/>
-              <w:sz w:val="22"/>
               <w:lang w:val="en-ZA"/>
             </w:rPr>
             <w:fldChar w:fldCharType="begin"/>
@@ -6038,14 +5988,12 @@
           <w:r>
             <w:rPr>
               <w:color w:val="000000"/>
-              <w:sz w:val="22"/>
             </w:rPr>
             <w:instrText xml:space="preserve"> CITATION Bel6b \l 1033 </w:instrText>
           </w:r>
           <w:r>
             <w:rPr>
               <w:color w:val="000000"/>
-              <w:sz w:val="22"/>
               <w:lang w:val="en-ZA"/>
             </w:rPr>
             <w:fldChar w:fldCharType="separate"/>
@@ -6054,14 +6002,12 @@
             <w:rPr>
               <w:noProof/>
               <w:color w:val="000000"/>
-              <w:sz w:val="22"/>
             </w:rPr>
             <w:t>(Belgium Campus ITversity, 2026 b)</w:t>
           </w:r>
           <w:r>
             <w:rPr>
               <w:color w:val="000000"/>
-              <w:sz w:val="22"/>
               <w:lang w:val="en-ZA"/>
             </w:rPr>
             <w:fldChar w:fldCharType="end"/>
@@ -6071,7 +6017,6 @@
       <w:r>
         <w:rPr>
           <w:color w:val="000000"/>
-          <w:sz w:val="22"/>
           <w:lang w:val="en-ZA"/>
         </w:rPr>
         <w:t>.</w:t>
@@ -6081,14 +6026,12 @@
       <w:pPr>
         <w:rPr>
           <w:color w:val="000000"/>
-          <w:sz w:val="22"/>
           <w:lang w:val="en-ZA"/>
         </w:rPr>
       </w:pPr>
       <w:r>
         <w:rPr>
           <w:color w:val="000000"/>
-          <w:sz w:val="22"/>
           <w:lang w:val="en-ZA"/>
         </w:rPr>
         <w:br w:type="page"/>
@@ -6113,14 +6056,12 @@
       <w:pPr>
         <w:spacing w:after="120" w:line="259" w:lineRule="auto"/>
         <w:rPr>
-          <w:sz w:val="22"/>
           <w:lang w:val="en-ZA"/>
         </w:rPr>
       </w:pPr>
       <w:r>
         <w:rPr>
           <w:color w:val="000000"/>
-          <w:sz w:val="22"/>
           <w:lang w:val="en-ZA"/>
         </w:rPr>
         <w:t>Project constraints are conditions that limit or influence how CivicConnect can be planned, developed, tested and operated. These constraints must influence the project’s scope, requirements and later engineering decisions rather than only being listed. The following constraints are based on the Master Project Brief and the Milestone 1 objective</w:t>
@@ -6128,7 +6069,6 @@
       <w:r>
         <w:rPr>
           <w:color w:val="000000"/>
-          <w:sz w:val="22"/>
           <w:lang w:val="en-ZA"/>
         </w:rPr>
         <w:t xml:space="preserve"> </w:t>
@@ -6137,7 +6077,6 @@
         <w:sdtPr>
           <w:rPr>
             <w:color w:val="000000"/>
-            <w:sz w:val="22"/>
             <w:lang w:val="en-ZA"/>
           </w:rPr>
           <w:id w:val="-1526701426"/>
@@ -6147,7 +6086,6 @@
           <w:r>
             <w:rPr>
               <w:color w:val="000000"/>
-              <w:sz w:val="22"/>
               <w:lang w:val="en-ZA"/>
             </w:rPr>
             <w:fldChar w:fldCharType="begin"/>
@@ -6155,14 +6093,12 @@
           <w:r>
             <w:rPr>
               <w:color w:val="000000"/>
-              <w:sz w:val="22"/>
             </w:rPr>
             <w:instrText xml:space="preserve"> CITATION Bel6a \l 1033 </w:instrText>
           </w:r>
           <w:r>
             <w:rPr>
               <w:color w:val="000000"/>
-              <w:sz w:val="22"/>
               <w:lang w:val="en-ZA"/>
             </w:rPr>
             <w:fldChar w:fldCharType="separate"/>
@@ -6171,14 +6107,12 @@
             <w:rPr>
               <w:noProof/>
               <w:color w:val="000000"/>
-              <w:sz w:val="22"/>
             </w:rPr>
             <w:t>(Belgium Campus ITversity, 2026 a)</w:t>
           </w:r>
           <w:r>
             <w:rPr>
               <w:color w:val="000000"/>
-              <w:sz w:val="22"/>
               <w:lang w:val="en-ZA"/>
             </w:rPr>
             <w:fldChar w:fldCharType="end"/>
@@ -6189,7 +6123,6 @@
         <w:sdtPr>
           <w:rPr>
             <w:color w:val="000000"/>
-            <w:sz w:val="22"/>
             <w:lang w:val="en-ZA"/>
           </w:rPr>
           <w:id w:val="-565801937"/>
@@ -6199,7 +6132,6 @@
           <w:r>
             <w:rPr>
               <w:color w:val="000000"/>
-              <w:sz w:val="22"/>
               <w:lang w:val="en-ZA"/>
             </w:rPr>
             <w:fldChar w:fldCharType="begin"/>
@@ -6207,14 +6139,12 @@
           <w:r>
             <w:rPr>
               <w:color w:val="000000"/>
-              <w:sz w:val="22"/>
             </w:rPr>
             <w:instrText xml:space="preserve"> CITATION Bel6b \l 1033 </w:instrText>
           </w:r>
           <w:r>
             <w:rPr>
               <w:color w:val="000000"/>
-              <w:sz w:val="22"/>
               <w:lang w:val="en-ZA"/>
             </w:rPr>
             <w:fldChar w:fldCharType="separate"/>
@@ -6223,7 +6153,6 @@
             <w:rPr>
               <w:noProof/>
               <w:color w:val="000000"/>
-              <w:sz w:val="22"/>
             </w:rPr>
             <w:t xml:space="preserve"> </w:t>
           </w:r>
@@ -6231,14 +6160,12 @@
             <w:rPr>
               <w:noProof/>
               <w:color w:val="000000"/>
-              <w:sz w:val="22"/>
             </w:rPr>
             <w:t>(Belgium Campus ITversity, 2026 b)</w:t>
           </w:r>
           <w:r>
             <w:rPr>
               <w:color w:val="000000"/>
-              <w:sz w:val="22"/>
               <w:lang w:val="en-ZA"/>
             </w:rPr>
             <w:fldChar w:fldCharType="end"/>
@@ -6248,10 +6175,28 @@
       <w:r>
         <w:rPr>
           <w:color w:val="000000"/>
-          <w:sz w:val="22"/>
           <w:lang w:val="en-ZA"/>
         </w:rPr>
         <w:t>.</w:t>
+      </w:r>
+    </w:p>
+    <w:p>
+      <w:pPr>
+        <w:keepNext/>
+        <w:spacing w:before="160" w:after="80" w:line="259" w:lineRule="auto"/>
+        <w:rPr>
+          <w:b/>
+          <w:color w:val="000000"/>
+          <w:lang w:val="en-ZA"/>
+        </w:rPr>
+      </w:pPr>
+      <w:r>
+        <w:rPr>
+          <w:b/>
+          <w:color w:val="000000"/>
+          <w:lang w:val="en-ZA"/>
+        </w:rPr>
+        <w:t>Constraint Register</w:t>
       </w:r>
     </w:p>
     <w:p>
@@ -6264,13 +6209,19 @@
       </w:pPr>
       <w:r>
         <w:rPr>
-          <w:b/>
-          <w:color w:val="000000"/>
-          <w:sz w:val="22"/>
           <w:lang w:val="en-ZA"/>
         </w:rPr>
-        <w:t>Constraint Register</w:t>
+        <w:t>The constraints are grouped into scope, technical, schedule, resource, quality, security and privacy, and academic and project-governance categories.</w:t>
       </w:r>
+    </w:p>
+    <w:p>
+      <w:pPr>
+        <w:keepNext/>
+        <w:spacing w:before="160" w:after="80" w:line="259" w:lineRule="auto"/>
+        <w:rPr>
+          <w:lang w:val="en-ZA"/>
+        </w:rPr>
+      </w:pPr>
     </w:p>
     <w:tbl>
       <w:tblPr>
@@ -6470,6 +6421,18 @@
               </w:rPr>
               <w:t>Scope</w:t>
             </w:r>
+            <w:r>
+              <w:rPr>
+                <w:lang w:val="en-ZA"/>
+              </w:rPr>
+              <w:t xml:space="preserve"> and pro</w:t>
+            </w:r>
+            <w:r>
+              <w:rPr>
+                <w:lang w:val="en-ZA"/>
+              </w:rPr>
+              <w:t>ject</w:t>
+            </w:r>
           </w:p>
         </w:tc>
         <w:tc>
@@ -6576,6 +6539,12 @@
               </w:rPr>
               <w:t>Schedule</w:t>
             </w:r>
+            <w:r>
+              <w:rPr>
+                <w:lang w:val="en-ZA"/>
+              </w:rPr>
+              <w:t xml:space="preserve"> </w:t>
+            </w:r>
           </w:p>
         </w:tc>
         <w:tc>
@@ -6680,7 +6649,7 @@
               <w:rPr>
                 <w:lang w:val="en-ZA"/>
               </w:rPr>
-              <w:t>Human resources</w:t>
+              <w:t>Resource</w:t>
             </w:r>
           </w:p>
         </w:tc>
@@ -6783,10 +6752,7 @@
               </w:rPr>
             </w:pPr>
             <w:r>
-              <w:rPr>
-                <w:lang w:val="en-ZA"/>
-              </w:rPr>
-              <w:t>Cost and services</w:t>
+              <w:t>Resource and cost</w:t>
             </w:r>
           </w:p>
         </w:tc>
@@ -6973,6 +6939,7 @@
               <w:rPr>
                 <w:lang w:val="en-ZA"/>
               </w:rPr>
+              <w:lastRenderedPageBreak/>
               <w:t>CON-006</w:t>
             </w:r>
           </w:p>
@@ -7000,6 +6967,12 @@
               </w:rPr>
               <w:t>Security</w:t>
             </w:r>
+            <w:r>
+              <w:rPr>
+                <w:lang w:val="en-ZA"/>
+              </w:rPr>
+              <w:t xml:space="preserve"> and Privacy</w:t>
+            </w:r>
           </w:p>
         </w:tc>
         <w:tc>
@@ -7023,7 +6996,19 @@
               <w:rPr>
                 <w:lang w:val="en-ZA"/>
               </w:rPr>
-              <w:t>Security must be considered throughout the project lifecycle and cannot be treated as a final addition.</w:t>
+              <w:t>Securit</w:t>
+            </w:r>
+            <w:r>
+              <w:rPr>
+                <w:lang w:val="en-ZA"/>
+              </w:rPr>
+              <w:t xml:space="preserve">y and privacy </w:t>
+            </w:r>
+            <w:r>
+              <w:rPr>
+                <w:lang w:val="en-ZA"/>
+              </w:rPr>
+              <w:t>must be considered throughout the project lifecycle and cannot be treated as a final addition.</w:t>
             </w:r>
           </w:p>
         </w:tc>
@@ -7101,10 +7086,7 @@
               </w:rPr>
             </w:pPr>
             <w:r>
-              <w:rPr>
-                <w:lang w:val="en-ZA"/>
-              </w:rPr>
-              <w:t>Technology</w:t>
+              <w:t>Technical</w:t>
             </w:r>
           </w:p>
         </w:tc>
@@ -7185,7 +7167,6 @@
               <w:rPr>
                 <w:lang w:val="en-ZA"/>
               </w:rPr>
-              <w:lastRenderedPageBreak/>
               <w:t>CON-008</w:t>
             </w:r>
           </w:p>
@@ -7208,10 +7189,7 @@
               </w:rPr>
             </w:pPr>
             <w:r>
-              <w:rPr>
-                <w:lang w:val="en-ZA"/>
-              </w:rPr>
-              <w:t>Project governance</w:t>
+              <w:t>Academic and project governance</w:t>
             </w:r>
           </w:p>
         </w:tc>
@@ -7279,7 +7257,6 @@
         <w:rPr>
           <w:b/>
           <w:color w:val="000000"/>
-          <w:sz w:val="22"/>
           <w:lang w:val="en-ZA"/>
         </w:rPr>
         <w:t>Constraint Interactions, Trade-offs and Ripple Effects</w:t>
@@ -7289,14 +7266,12 @@
       <w:pPr>
         <w:spacing w:after="120" w:line="259" w:lineRule="auto"/>
         <w:rPr>
-          <w:sz w:val="22"/>
           <w:lang w:val="en-ZA"/>
         </w:rPr>
       </w:pPr>
       <w:r>
         <w:rPr>
           <w:color w:val="000000"/>
-          <w:sz w:val="22"/>
           <w:lang w:val="en-ZA"/>
         </w:rPr>
         <w:t>The constraints are connected, meaning that a change in one area may create consequences in several other areas.</w:t>
@@ -7781,6 +7756,7 @@
               <w:rPr>
                 <w:lang w:val="en-ZA"/>
               </w:rPr>
+              <w:lastRenderedPageBreak/>
               <w:t>Schedule and quality</w:t>
             </w:r>
           </w:p>
@@ -7849,7 +7825,6 @@
         <w:rPr>
           <w:b/>
           <w:color w:val="000000"/>
-          <w:sz w:val="22"/>
           <w:lang w:val="en-ZA"/>
         </w:rPr>
         <w:t>Key Constraint Interaction</w:t>
@@ -7859,14 +7834,12 @@
       <w:pPr>
         <w:spacing w:after="120" w:line="259" w:lineRule="auto"/>
         <w:rPr>
-          <w:sz w:val="22"/>
           <w:lang w:val="en-ZA"/>
         </w:rPr>
       </w:pPr>
       <w:r>
         <w:rPr>
           <w:color w:val="000000"/>
-          <w:sz w:val="22"/>
           <w:lang w:val="en-ZA"/>
         </w:rPr>
         <w:t xml:space="preserve">The most significant current interaction is between team capacity, schedule and scope. CivicConnect must be completed by three students within four formal milestones. If the team adds non-essential features, the amount of requirement, implementation, security and testing work will increase. This could place </w:t>
@@ -7874,7 +7847,6 @@
       <w:r>
         <w:rPr>
           <w:color w:val="000000"/>
-          <w:sz w:val="22"/>
           <w:lang w:val="en-ZA"/>
         </w:rPr>
         <w:t>milestone</w:t>
@@ -7882,7 +7854,6 @@
       <w:r>
         <w:rPr>
           <w:color w:val="000000"/>
-          <w:sz w:val="22"/>
           <w:lang w:val="en-ZA"/>
         </w:rPr>
         <w:t xml:space="preserve"> deadlines and overall system quality at risk. The team has therefore limited the baseline to the required business capabilities and deferred additional features such as native mobile applications, external messaging integrations and artificial intelligence-based request prioritisation.</w:t>
@@ -7892,14 +7863,12 @@
       <w:pPr>
         <w:spacing w:after="120" w:line="259" w:lineRule="auto"/>
         <w:rPr>
-          <w:sz w:val="22"/>
           <w:lang w:val="en-ZA"/>
         </w:rPr>
       </w:pPr>
       <w:r>
         <w:rPr>
           <w:color w:val="000000"/>
-          <w:sz w:val="22"/>
           <w:lang w:val="en-ZA"/>
         </w:rPr>
         <w:t>The technology constraint also creates an important trade-off. Although free or low-cost technologies may reduce immediate project costs, an unfamiliar platform may introduce a learning curve and increase the risk of delays or implementation errors. Technology choices must therefore consider both financial cost and the team’s ability to use, test and maintain the selected solution.</w:t>
@@ -7937,13 +7906,11 @@
     <w:p>
       <w:pPr>
         <w:rPr>
-          <w:sz w:val="22"/>
           <w:lang w:val="en-ZA"/>
         </w:rPr>
       </w:pPr>
       <w:r>
         <w:rPr>
-          <w:sz w:val="22"/>
           <w:lang w:val="en-ZA"/>
         </w:rPr>
         <w:t xml:space="preserve">Assumptions are conditions that the team currently believes to be true but has not yet fully confirmed. They differ from constraints because constraints are known limitations, while assumptions still require verification. If an important assumption is incorrect, it may affect the project’s scope, requirements, design, schedule, cost, quality or security. Material assumptions must therefore be monitored and considered in the Risk Register </w:t>
@@ -7951,7 +7918,6 @@
       <w:sdt>
         <w:sdtPr>
           <w:rPr>
-            <w:sz w:val="22"/>
             <w:lang w:val="en-ZA"/>
           </w:rPr>
           <w:id w:val="851463801"/>
@@ -7960,20 +7926,15 @@
         <w:sdtContent>
           <w:r>
             <w:rPr>
-              <w:sz w:val="22"/>
               <w:lang w:val="en-ZA"/>
             </w:rPr>
             <w:fldChar w:fldCharType="begin"/>
           </w:r>
           <w:r>
-            <w:rPr>
-              <w:sz w:val="22"/>
-            </w:rPr>
             <w:instrText xml:space="preserve"> CITATION Bel6a \l 1033 </w:instrText>
           </w:r>
           <w:r>
             <w:rPr>
-              <w:sz w:val="22"/>
               <w:lang w:val="en-ZA"/>
             </w:rPr>
             <w:fldChar w:fldCharType="separate"/>
@@ -7981,13 +7942,11 @@
           <w:r>
             <w:rPr>
               <w:noProof/>
-              <w:sz w:val="22"/>
             </w:rPr>
             <w:t>(Belgium Campus ITversity, 2026 a)</w:t>
           </w:r>
           <w:r>
             <w:rPr>
-              <w:sz w:val="22"/>
               <w:lang w:val="en-ZA"/>
             </w:rPr>
             <w:fldChar w:fldCharType="end"/>
@@ -7996,10 +7955,27 @@
       </w:sdt>
       <w:r>
         <w:rPr>
-          <w:sz w:val="22"/>
           <w:lang w:val="en-ZA"/>
         </w:rPr>
         <w:t>.</w:t>
+      </w:r>
+    </w:p>
+    <w:p>
+      <w:pPr>
+        <w:rPr>
+          <w:lang w:val="en-ZA"/>
+        </w:rPr>
+      </w:pPr>
+      <w:r>
+        <w:t xml:space="preserve">The assumptions cover stakeholders, users, technical matters, operations and external services. </w:t>
+      </w:r>
+      <w:proofErr w:type="spellStart"/>
+      <w:r>
+        <w:t>CivicConnect</w:t>
+      </w:r>
+      <w:proofErr w:type="spellEnd"/>
+      <w:r>
+        <w:t xml:space="preserve"> is not currently expected to depend on external datasets or third-party data feeds because request information will be entered and managed within the system. If an external data source is introduced later, it will need to be validated and assessed through change control.</w:t>
       </w:r>
     </w:p>
     <w:p>
@@ -8014,7 +7990,6 @@
         <w:rPr>
           <w:b/>
           <w:color w:val="000000"/>
-          <w:sz w:val="22"/>
           <w:lang w:val="en-ZA"/>
         </w:rPr>
         <w:t>Assumptions Register</w:t>
@@ -8066,7 +8041,6 @@
           <w:p>
             <w:pPr>
               <w:rPr>
-                <w:sz w:val="22"/>
                 <w:lang w:val="en-ZA"/>
               </w:rPr>
             </w:pPr>
@@ -8074,7 +8048,6 @@
               <w:rPr>
                 <w:b/>
                 <w:color w:val="000000"/>
-                <w:sz w:val="22"/>
                 <w:lang w:val="en-ZA"/>
               </w:rPr>
               <w:t>ID</w:t>
@@ -8096,7 +8069,6 @@
           <w:p>
             <w:pPr>
               <w:rPr>
-                <w:sz w:val="22"/>
                 <w:lang w:val="en-ZA"/>
               </w:rPr>
             </w:pPr>
@@ -8104,7 +8076,6 @@
               <w:rPr>
                 <w:b/>
                 <w:color w:val="000000"/>
-                <w:sz w:val="22"/>
                 <w:lang w:val="en-ZA"/>
               </w:rPr>
               <w:t>Assumption</w:t>
@@ -8126,7 +8097,6 @@
           <w:p>
             <w:pPr>
               <w:rPr>
-                <w:sz w:val="22"/>
                 <w:lang w:val="en-ZA"/>
               </w:rPr>
             </w:pPr>
@@ -8134,7 +8104,6 @@
               <w:rPr>
                 <w:b/>
                 <w:color w:val="000000"/>
-                <w:sz w:val="22"/>
                 <w:lang w:val="en-ZA"/>
               </w:rPr>
               <w:t>Why it matters</w:t>
@@ -8156,7 +8125,6 @@
           <w:p>
             <w:pPr>
               <w:rPr>
-                <w:sz w:val="22"/>
                 <w:lang w:val="en-ZA"/>
               </w:rPr>
             </w:pPr>
@@ -8164,7 +8132,6 @@
               <w:rPr>
                 <w:b/>
                 <w:color w:val="000000"/>
-                <w:sz w:val="22"/>
                 <w:lang w:val="en-ZA"/>
               </w:rPr>
               <w:t>Impact if incorrect</w:t>
@@ -8186,7 +8153,6 @@
           <w:p>
             <w:pPr>
               <w:rPr>
-                <w:sz w:val="22"/>
                 <w:lang w:val="en-ZA"/>
               </w:rPr>
             </w:pPr>
@@ -8194,7 +8160,6 @@
               <w:rPr>
                 <w:b/>
                 <w:color w:val="000000"/>
-                <w:sz w:val="22"/>
                 <w:lang w:val="en-ZA"/>
               </w:rPr>
               <w:t>Verification action</w:t>
@@ -8216,7 +8181,6 @@
           <w:p>
             <w:pPr>
               <w:rPr>
-                <w:sz w:val="22"/>
                 <w:lang w:val="en-ZA"/>
               </w:rPr>
             </w:pPr>
@@ -8224,7 +8188,6 @@
               <w:rPr>
                 <w:b/>
                 <w:color w:val="000000"/>
-                <w:sz w:val="22"/>
                 <w:lang w:val="en-ZA"/>
               </w:rPr>
               <w:t>Owner</w:t>
@@ -8246,7 +8209,6 @@
           <w:p>
             <w:pPr>
               <w:rPr>
-                <w:sz w:val="22"/>
                 <w:lang w:val="en-ZA"/>
               </w:rPr>
             </w:pPr>
@@ -8254,7 +8216,6 @@
               <w:rPr>
                 <w:b/>
                 <w:color w:val="000000"/>
-                <w:sz w:val="22"/>
                 <w:lang w:val="en-ZA"/>
               </w:rPr>
               <w:t>Status</w:t>
@@ -8831,6 +8792,7 @@
               <w:rPr>
                 <w:lang w:val="en-ZA"/>
               </w:rPr>
+              <w:lastRenderedPageBreak/>
               <w:t>ASM-004</w:t>
             </w:r>
           </w:p>
@@ -9012,7 +8974,6 @@
               <w:rPr>
                 <w:lang w:val="en-ZA"/>
               </w:rPr>
-              <w:lastRenderedPageBreak/>
               <w:t>ASM-005</w:t>
             </w:r>
           </w:p>
@@ -9556,6 +9517,7 @@
               <w:rPr>
                 <w:lang w:val="en-ZA"/>
               </w:rPr>
+              <w:lastRenderedPageBreak/>
               <w:t>ASM-008</w:t>
             </w:r>
           </w:p>
@@ -9731,7 +9693,6 @@
             <w:pPr>
               <w:rPr>
                 <w:rFonts w:asciiTheme="majorHAnsi" w:hAnsiTheme="majorHAnsi" w:cstheme="majorHAnsi"/>
-                <w:sz w:val="22"/>
                 <w:lang w:val="en-ZA"/>
               </w:rPr>
             </w:pPr>
@@ -9739,7 +9700,6 @@
               <w:rPr>
                 <w:rFonts w:asciiTheme="majorHAnsi" w:hAnsiTheme="majorHAnsi" w:cstheme="majorHAnsi"/>
                 <w:color w:val="000000"/>
-                <w:sz w:val="22"/>
                 <w:lang w:val="en-ZA"/>
               </w:rPr>
               <w:t>ASM-009</w:t>
@@ -9761,7 +9721,6 @@
             <w:pPr>
               <w:rPr>
                 <w:rFonts w:asciiTheme="majorHAnsi" w:hAnsiTheme="majorHAnsi" w:cstheme="majorHAnsi"/>
-                <w:sz w:val="22"/>
                 <w:lang w:val="en-ZA"/>
               </w:rPr>
             </w:pPr>
@@ -9769,7 +9728,6 @@
               <w:rPr>
                 <w:rFonts w:asciiTheme="majorHAnsi" w:hAnsiTheme="majorHAnsi" w:cstheme="majorHAnsi"/>
                 <w:color w:val="000000"/>
-                <w:sz w:val="22"/>
                 <w:lang w:val="en-ZA"/>
               </w:rPr>
               <w:t>All three team members will have access to the agreed repository, development tools and compatible working environments.</w:t>
@@ -9791,7 +9749,6 @@
             <w:pPr>
               <w:rPr>
                 <w:rFonts w:asciiTheme="majorHAnsi" w:hAnsiTheme="majorHAnsi" w:cstheme="majorHAnsi"/>
-                <w:sz w:val="22"/>
                 <w:lang w:val="en-ZA"/>
               </w:rPr>
             </w:pPr>
@@ -9799,7 +9756,6 @@
               <w:rPr>
                 <w:rFonts w:asciiTheme="majorHAnsi" w:hAnsiTheme="majorHAnsi" w:cstheme="majorHAnsi"/>
                 <w:color w:val="000000"/>
-                <w:sz w:val="22"/>
                 <w:lang w:val="en-ZA"/>
               </w:rPr>
               <w:t>Controlled collaboration and individual contribution evidence depend on each member being able to use the project tools.</w:t>
@@ -9821,7 +9777,6 @@
             <w:pPr>
               <w:rPr>
                 <w:rFonts w:asciiTheme="majorHAnsi" w:hAnsiTheme="majorHAnsi" w:cstheme="majorHAnsi"/>
-                <w:sz w:val="22"/>
                 <w:lang w:val="en-ZA"/>
               </w:rPr>
             </w:pPr>
@@ -9829,7 +9784,6 @@
               <w:rPr>
                 <w:rFonts w:asciiTheme="majorHAnsi" w:hAnsiTheme="majorHAnsi" w:cstheme="majorHAnsi"/>
                 <w:color w:val="000000"/>
-                <w:sz w:val="22"/>
                 <w:lang w:val="en-ZA"/>
               </w:rPr>
               <w:t>Access or compatibility problems could delay work, reduce contribution evidence or create integration difficulties.</w:t>
@@ -9851,7 +9805,6 @@
             <w:pPr>
               <w:rPr>
                 <w:rFonts w:asciiTheme="majorHAnsi" w:hAnsiTheme="majorHAnsi" w:cstheme="majorHAnsi"/>
-                <w:sz w:val="22"/>
                 <w:lang w:val="en-ZA"/>
               </w:rPr>
             </w:pPr>
@@ -9859,7 +9812,6 @@
               <w:rPr>
                 <w:rFonts w:asciiTheme="majorHAnsi" w:hAnsiTheme="majorHAnsi" w:cstheme="majorHAnsi"/>
                 <w:color w:val="000000"/>
-                <w:sz w:val="22"/>
                 <w:lang w:val="en-ZA"/>
               </w:rPr>
               <w:t>Confirm repository access and tool compatibility for all team members before implementation begins.</w:t>
@@ -9881,7 +9833,6 @@
             <w:pPr>
               <w:rPr>
                 <w:rFonts w:asciiTheme="majorHAnsi" w:hAnsiTheme="majorHAnsi" w:cstheme="majorHAnsi"/>
-                <w:sz w:val="22"/>
                 <w:lang w:val="en-ZA"/>
               </w:rPr>
             </w:pPr>
@@ -9889,7 +9840,6 @@
               <w:rPr>
                 <w:rFonts w:asciiTheme="majorHAnsi" w:hAnsiTheme="majorHAnsi" w:cstheme="majorHAnsi"/>
                 <w:color w:val="000000"/>
-                <w:sz w:val="22"/>
                 <w:lang w:val="en-ZA"/>
               </w:rPr>
               <w:t>GitHub and governance lead</w:t>
@@ -9911,7 +9861,6 @@
             <w:pPr>
               <w:rPr>
                 <w:rFonts w:asciiTheme="majorHAnsi" w:hAnsiTheme="majorHAnsi" w:cstheme="majorHAnsi"/>
-                <w:sz w:val="22"/>
                 <w:lang w:val="en-ZA"/>
               </w:rPr>
             </w:pPr>
@@ -9919,7 +9868,6 @@
               <w:rPr>
                 <w:rFonts w:asciiTheme="majorHAnsi" w:hAnsiTheme="majorHAnsi" w:cstheme="majorHAnsi"/>
                 <w:color w:val="000000"/>
-                <w:sz w:val="22"/>
                 <w:lang w:val="en-ZA"/>
               </w:rPr>
               <w:t>To be verified</w:t>
@@ -9954,7 +9902,6 @@
         <w:rPr>
           <w:b/>
           <w:color w:val="000000"/>
-          <w:sz w:val="22"/>
           <w:lang w:val="en-ZA"/>
         </w:rPr>
         <w:lastRenderedPageBreak/>
@@ -9964,13 +9911,11 @@
     <w:p>
       <w:pPr>
         <w:rPr>
-          <w:sz w:val="22"/>
           <w:lang w:val="en-ZA"/>
         </w:rPr>
       </w:pPr>
       <w:r>
         <w:rPr>
-          <w:sz w:val="22"/>
           <w:lang w:val="en-ZA"/>
         </w:rPr>
         <w:t>The assumptions with the greatest current effect are ASM-004, ASM-005, ASM-006 and ASM-008. Unclear user roles could create unauthorised access, while inconsistent staff updates could prevent CivicConnect from providing reliable tracking and reporting. A lack of stakeholder validation could result in incorrect scope or requirements, and the loss or limitation of a selected low-cost service could affect the schedule and deployment plan.</w:t>
@@ -9979,13 +9924,11 @@
     <w:p>
       <w:pPr>
         <w:rPr>
-          <w:sz w:val="22"/>
           <w:lang w:val="en-ZA"/>
         </w:rPr>
       </w:pPr>
       <w:r>
         <w:rPr>
-          <w:sz w:val="22"/>
           <w:lang w:val="en-ZA"/>
         </w:rPr>
         <w:t>These assumptions must be considered when Phase D develops the Risk Register. If an assumption is confirmed, its status and supporting evidence should be updated. If an assumption proves incorrect, the team must assess its effect on the scope, requirements, constraints, risks and related engineering decisions instead of silently changing the baseline.</w:t>
@@ -9994,13 +9937,11 @@
     <w:p>
       <w:pPr>
         <w:rPr>
-          <w:sz w:val="22"/>
           <w:lang w:val="en-ZA"/>
         </w:rPr>
       </w:pPr>
       <w:r>
         <w:rPr>
-          <w:sz w:val="22"/>
           <w:lang w:val="en-ZA"/>
         </w:rPr>
         <w:br w:type="page"/>
@@ -10008,6 +9949,13 @@
     </w:p>
     <w:sdt>
       <w:sdtPr>
+        <w:rPr>
+          <w:rFonts w:ascii="Arial" w:eastAsiaTheme="minorEastAsia" w:hAnsi="Arial" w:cstheme="minorBidi"/>
+          <w:b w:val="0"/>
+          <w:bCs w:val="0"/>
+          <w:sz w:val="20"/>
+          <w:szCs w:val="22"/>
+        </w:rPr>
         <w:id w:val="1076165290"/>
         <w:docPartObj>
           <w:docPartGallery w:val="Bibliographies"/>
@@ -10016,11 +9964,7 @@
       </w:sdtPr>
       <w:sdtEndPr>
         <w:rPr>
-          <w:rFonts w:ascii="Arial" w:eastAsiaTheme="minorEastAsia" w:hAnsi="Arial" w:cstheme="minorBidi"/>
-          <w:b w:val="0"/>
-          <w:bCs w:val="0"/>
-          <w:sz w:val="20"/>
-          <w:szCs w:val="22"/>
+          <w:sz w:val="22"/>
         </w:rPr>
       </w:sdtEndPr>
       <w:sdtContent>
@@ -10122,7 +10066,6 @@
     <w:p>
       <w:pPr>
         <w:rPr>
-          <w:sz w:val="22"/>
           <w:lang w:val="en-ZA"/>
         </w:rPr>
       </w:pPr>
@@ -10738,10 +10681,9 @@
   <w:style w:type="paragraph" w:default="1" w:styleId="Normal">
     <w:name w:val="Normal"/>
     <w:qFormat/>
-    <w:rsid w:val="0026068B"/>
+    <w:rsid w:val="00A0150F"/>
     <w:rPr>
       <w:rFonts w:ascii="Arial" w:hAnsi="Arial"/>
-      <w:sz w:val="20"/>
     </w:rPr>
   </w:style>
   <w:style w:type="paragraph" w:styleId="Heading1">
@@ -10952,7 +10894,6 @@
   <w:style w:type="character" w:default="1" w:styleId="DefaultParagraphFont">
     <w:name w:val="Default Paragraph Font"/>
     <w:uiPriority w:val="1"/>
-    <w:semiHidden/>
     <w:unhideWhenUsed/>
   </w:style>
   <w:style w:type="table" w:default="1" w:styleId="TableNormal">

</xml_diff>